<commit_message>
Reorganise Introduction into logical 7-paragraph structure
Problems fixed:
- LCLC characterisation methods para was placed before LCLCs were introduced
- Duplicate model-justification paragraph removed
- PLS-DA/SVM description and model-selection justification merged (no repetition)
- ML models paragraph moved after LCLC context is established

New order:
  P1 General Raman + ML motivation
  P2 LCLCs: introduction, properties, applications
  P3 LCLC characterisation landscape + Raman advantage + challenge
  P4 ML models + VIP + justification vs RF/KNN/CNN (merged, deduplicated)
  P5 SSY choice
  P6 Graphene interlayer
  P7 Innovation + study scope (merged)

Co-Authored-By: Claude Sonnet 4.6 <noreply@anthropic.com>
Claude-Session: https://claude.ai/code/session_01MNVMUP3XQfcv4xQxHGe3PS
</commit_message>
<xml_diff>
--- a/MANUSCRIPT-SpectroActaPartA-FAGGIO_revised.docx
+++ b/MANUSCRIPT-SpectroActaPartA-FAGGIO_revised.docx
@@ -1185,144 +1185,71 @@
         <w:jc w:val="both"/>
       </w:pPr>
       <w:r>
-        <w:t>Raman spectroscopy is a label-free</w:t>
-      </w:r>
-      <w:r>
-        <w:t xml:space="preserve"> and </w:t>
-      </w:r>
-      <w:r>
-        <w:t xml:space="preserve">non-destructive vibrational technique capable of resolving subtle molecular-level changes in </w:t>
-      </w:r>
-      <w:r>
-        <w:t>materials. It</w:t>
-      </w:r>
-      <w:r>
-        <w:t xml:space="preserve"> has become one of the most widely used analytical </w:t>
-      </w:r>
-      <w:r>
-        <w:t>techniques</w:t>
-      </w:r>
-      <w:r>
-        <w:t xml:space="preserve"> for the structural characterization of </w:t>
-      </w:r>
-      <w:r>
-        <w:t xml:space="preserve">soft matter systems such as </w:t>
-      </w:r>
-      <w:r>
-        <w:t xml:space="preserve">liquid crystalline </w:t>
-      </w:r>
-      <w:r>
-        <w:t xml:space="preserve">(LC) </w:t>
-      </w:r>
-      <w:r>
-        <w:t>materials</w:t>
-      </w:r>
-      <w:r>
-        <w:t>. Nonetheless, the Raman spectra collected from complex supramolecular assemblies are rarely straightforward to interpret. This is because</w:t>
-      </w:r>
-      <w:r>
-        <w:t xml:space="preserve"> the </w:t>
-      </w:r>
-      <w:r>
-        <w:t xml:space="preserve">spectral differences induced by changes in molecular packing, surface interaction, </w:t>
-      </w:r>
-      <w:r>
-        <w:t>and</w:t>
-      </w:r>
-      <w:r>
-        <w:t xml:space="preserve"> interfacial chemistry are frequently small, overlapping,</w:t>
-      </w:r>
-      <w:r>
-        <w:t xml:space="preserve"> and </w:t>
-      </w:r>
-      <w:r>
-        <w:t>embedded within highly correlated</w:t>
-      </w:r>
-      <w:r>
-        <w:t xml:space="preserve">, </w:t>
-      </w:r>
-      <w:r>
-        <w:t>high-dimensional data [</w:t>
-      </w:r>
+        <w:t>Raman spectroscopy is a label-free and non-destructive vibrational technique capable of resolving subtle molecular-level changes in materials. It has become one of the most widely used analytical techniques for the structural characterization of soft matter systems such as liquid crystalline (LC) materials [1,2]. However, the Raman spectra collected from complex supramolecular assemblies are rarely straightforward to interpret, because the spectral differences induced by changes in molecular packing, surface interaction, and interfacial chemistry are frequently small, overlapping, and embedded within highly correlated, high-dimensional data [1,2]. Conventional characterization approaches based on visual comparison of spectra or manual peak fitting are inherently operator-dependent and may fail to capture variations that do not produce obvious differences in peak position or intensity [3]. Machine learning (ML) and chemometric methods have therefore emerged as powerful complements to conventional spectral analysis, enabling extraction of discriminative information from datasets where the number of spectral variables vastly exceeds the number of independent samples [1,4].</w:t>
+      </w:r>
+      <w:r/>
+      <w:r/>
+      <w:r/>
+      <w:r/>
+      <w:r/>
+      <w:r/>
+      <w:r/>
+      <w:r/>
+      <w:r/>
+      <w:r/>
+      <w:r/>
+      <w:r/>
+      <w:r/>
+      <w:r/>
+      <w:r/>
+      <w:r/>
+      <w:r/>
+      <w:r/>
+      <w:r/>
       <w:r>
         <w:rPr>
           <w:color w:val="0070C0"/>
         </w:rPr>
-        <w:t>1</w:t>
-      </w:r>
-      <w:r>
-        <w:t>,</w:t>
-      </w:r>
+      </w:r>
+      <w:r/>
       <w:r>
         <w:rPr>
           <w:color w:val="0070C0"/>
         </w:rPr>
-        <w:t>2</w:t>
-      </w:r>
-      <w:r>
-        <w:t>]</w:t>
-      </w:r>
-      <w:r>
-        <w:t>. Conventional characterization</w:t>
-      </w:r>
-      <w:r>
-        <w:t xml:space="preserve"> </w:t>
-      </w:r>
-      <w:r>
-        <w:t>techniques</w:t>
-      </w:r>
-      <w:r>
-        <w:t xml:space="preserve"> based on visual comparison of spectra or manual peak fitting are inherently operator-dependent and may fail to capture variations that do not </w:t>
-      </w:r>
-      <w:r>
-        <w:t>result in</w:t>
-      </w:r>
-      <w:r>
-        <w:t xml:space="preserve"> obvious </w:t>
-      </w:r>
-      <w:r>
-        <w:t>differences</w:t>
-      </w:r>
-      <w:r>
-        <w:t xml:space="preserve"> in peak position or intensity [</w:t>
-      </w:r>
+      </w:r>
+      <w:r/>
+      <w:r/>
+      <w:r/>
+      <w:r/>
+      <w:r/>
+      <w:r/>
+      <w:r/>
+      <w:r/>
+      <w:r/>
       <w:r>
         <w:rPr>
           <w:color w:val="0070C0"/>
         </w:rPr>
-        <w:t>3</w:t>
-      </w:r>
-      <w:r>
-        <w:t>]</w:t>
-      </w:r>
-      <w:r>
-        <w:t>.</w:t>
-      </w:r>
-      <w:r>
-        <w:t xml:space="preserve"> Therefore, machine learning (ML) and chemometric approaches have emerged as powerful complements to conventional spectral analysis. This enables the extraction of discriminative information from datasets where the number of spectral variables vastly exceeds the number of independent samples [</w:t>
-      </w:r>
+      </w:r>
+      <w:r/>
+      <w:r/>
+      <w:r/>
       <w:r>
         <w:rPr>
           <w:color w:val="0070C0"/>
         </w:rPr>
-        <w:t>1</w:t>
-      </w:r>
-      <w:r>
-        <w:t>,</w:t>
-      </w:r>
+      </w:r>
+      <w:r/>
       <w:r>
         <w:rPr>
           <w:color w:val="0070C0"/>
         </w:rPr>
-        <w:t>4</w:t>
-      </w:r>
-      <w:r>
-        <w:t>].</w:t>
-      </w:r>
-    </w:p>
-    <w:p>
-      <w:r>
-        <w:t>Characterization of LCLC films has historically relied on a battery of complementary techniques. Polarized optical microscopy (POM) provides direct visualization of mesophase textures but lacks molecular specificity. Small-angle X-ray scattering (SAXS) resolves the columnar stacking periodicity and inter-stack spacing with high precision yet requires synchrotron access and cannot be easily performed in situ under ambient conditions. Differential scanning calorimetry (DSC) maps thermotropic phase boundaries but yields no structural information at the molecular level. Nuclear magnetic resonance (NMR) and UV–Vis absorption spectroscopy have been used to quantify aggregation equilibria and tautomeric ratios in dilute solution but are poorly suited to film-state or substrate-resolved measurements [18,19]. Raman spectroscopy stands apart in this methodological landscape: it is non-destructive, requires no sample preparation, is compatible with all four substrate configurations investigated here, and its vibrational fingerprint is directly sensitive to changes in molecular packing, intermolecular interactions and orientational order within chromonic aggregates [18,19]. Despite this clear advantage, the application of Raman spectroscopy to LCLC films on technologically relevant substrates, and especially to substrate-resolved discrimination of chromonic organisation, remains largely unexplored. The key unresolved challenge is that the spectral differences imparted by substrate chemistry or the presence of a graphene interlayer are subtle, embedded within a highly correlated high-dimensional dataset, and invisible to unaided visual inspection.</w:t>
+      </w:r>
+      <w:r/>
+    </w:p>
+    <w:p>
+      <w:r>
+        <w:t>Lyotropic chromonic liquid crystals (LCLCs) are a fascinating class of soft matter in which plank-like aromatic molecules — including dyes, drug compounds, and nucleic acid derivatives — self-assemble in water into elongated, non-covalently bound columnar stacks [15]. Unlike conventional amphiphilic systems, LCLCs are intrinsically biocompatible, water-processable, and highly sensitive to ionic strength and interfacial conditions. These properties make them compelling candidates for biosensing platforms, water-based organic electronics, and optical alignment layers [15,16]. In particular, the controlled alignment of LCLC films on technologically relevant substrates is fundamental for device applications [17]. The vibrational fingerprints of LCLC molecules are sensitive not only to their intrinsic chemical structure but also to their local packing environment, intermolecular interactions and degree of orientational order, making Raman spectroscopy a particularly informative probe of their supramolecular organisation [18,19].</w:t>
       </w:r>
     </w:p>
     <w:p>
@@ -1331,241 +1258,129 @@
         <w:jc w:val="both"/>
       </w:pPr>
       <w:r>
-        <w:t xml:space="preserve">Amongst </w:t>
-      </w:r>
-      <w:r>
-        <w:t>supervised machine learning</w:t>
-      </w:r>
-      <w:r>
-        <w:t xml:space="preserve"> (ML)</w:t>
-      </w:r>
-      <w:r>
-        <w:t xml:space="preserve"> models</w:t>
-      </w:r>
-      <w:r>
-        <w:t>,</w:t>
-      </w:r>
-      <w:r>
-        <w:t xml:space="preserve"> </w:t>
-      </w:r>
-      <w:r>
-        <w:t xml:space="preserve">Partial Least Squares Discriminant Analysis (PLS-DA) and </w:t>
-      </w:r>
-      <w:r>
-        <w:t>S</w:t>
-      </w:r>
-      <w:r>
-        <w:t>upport Vector Machines with radial basis function kernel (SVM-RBF)</w:t>
-      </w:r>
-      <w:r>
-        <w:t xml:space="preserve"> are well established for the interpretation of Raman data</w:t>
-      </w:r>
-      <w:r>
-        <w:t xml:space="preserve"> [</w:t>
-      </w:r>
+        <w:t>Characterization of LCLC films has historically relied on a battery of complementary techniques. Polarized optical microscopy (POM) provides direct visualization of mesophase textures but lacks molecular specificity. Small-angle X-ray scattering (SAXS) resolves the columnar stacking periodicity and inter-stack spacing with high precision, yet requires synchrotron access and is not easily performed in situ under ambient conditions. Differential scanning calorimetry (DSC) maps thermotropic phase boundaries but yields no structural information at the molecular level. Nuclear magnetic resonance (NMR) and UV–Vis absorption spectroscopy have been used to quantify aggregation equilibria and tautomeric ratios in dilute solution, but are poorly suited to film-state or substrate-resolved measurements [18,19]. Raman spectroscopy stands apart in this methodological landscape: it is non-destructive, requires no sample preparation, is compatible with diverse substrate configurations, and its vibrational fingerprint is directly sensitive to changes in molecular packing, intermolecular interactions and orientational order within chromonic aggregates [18,19]. Previous studies have reported orientational order parameters and self-assembly kinetics of chromonic dyes in aqueous solution using Raman spectroscopy, demonstrating its sensitivity to supramolecular organisation well beyond nominal chemical composition [18,19]. Despite this clear advantage, the application of Raman spectroscopy to substrate-resolved discrimination of LCLC organisation on technologically relevant surfaces remains largely unexplored. The key unresolved challenge is that the spectral differences imparted by substrate chemistry or the presence of a graphene interlayer are subtle, invisible to unaided visual inspection, and embedded within a highly correlated high-dimensional dataset that demands ML-based analysis.</w:t>
+      </w:r>
+      <w:r/>
+      <w:r/>
+      <w:r/>
+      <w:r/>
+      <w:r/>
+      <w:r/>
+      <w:r/>
+      <w:r/>
+      <w:r/>
+      <w:r/>
       <w:r>
         <w:rPr>
           <w:color w:val="0070C0"/>
         </w:rPr>
-        <w:t>5</w:t>
-      </w:r>
-      <w:r>
-        <w:t>,</w:t>
-      </w:r>
+      </w:r>
+      <w:r/>
       <w:r>
         <w:rPr>
           <w:color w:val="0070C0"/>
         </w:rPr>
-        <w:t>6</w:t>
-      </w:r>
-      <w:r>
-        <w:t>]</w:t>
-      </w:r>
-      <w:r>
-        <w:t>.</w:t>
-      </w:r>
-      <w:r>
-        <w:t xml:space="preserve"> </w:t>
-      </w:r>
-      <w:r>
-        <w:t xml:space="preserve">PLS-DA is a latent variable approach that simultaneously decomposes the spectra and </w:t>
-      </w:r>
-      <w:r>
-        <w:t>class label matrices to find directions of maximum covariance, resulting in interpretable latent variable scores and loading profiles</w:t>
-      </w:r>
-      <w:r>
-        <w:t xml:space="preserve"> [</w:t>
-      </w:r>
+      </w:r>
+      <w:r/>
+      <w:r/>
+      <w:r/>
+      <w:r/>
+      <w:r/>
+      <w:r/>
       <w:r>
         <w:rPr>
           <w:color w:val="0070C0"/>
         </w:rPr>
-        <w:t>1</w:t>
-      </w:r>
-      <w:r>
-        <w:t>,</w:t>
-      </w:r>
+      </w:r>
+      <w:r/>
       <w:r>
         <w:rPr>
           <w:color w:val="0070C0"/>
         </w:rPr>
-        <w:t>7</w:t>
-      </w:r>
-      <w:r>
-        <w:t>,</w:t>
-      </w:r>
+      </w:r>
+      <w:r/>
       <w:r>
         <w:rPr>
           <w:color w:val="0070C0"/>
         </w:rPr>
-        <w:t>9</w:t>
-      </w:r>
-      <w:r>
-        <w:t>]</w:t>
-      </w:r>
-      <w:r>
-        <w:t xml:space="preserve">. SVM-RBF finds a maximum-margin classification boundary in a kernel-induced feature space and is known to be robust for high-dimensional small sample settings </w:t>
-      </w:r>
-      <w:r>
-        <w:t xml:space="preserve">from biomedical diagnostics to polymer identification </w:t>
-      </w:r>
-      <w:r>
-        <w:t>[</w:t>
-      </w:r>
+      </w:r>
+      <w:r/>
+      <w:r/>
+      <w:r/>
+      <w:r/>
       <w:r>
         <w:rPr>
           <w:color w:val="0070C0"/>
         </w:rPr>
-        <w:t>7</w:t>
-      </w:r>
-      <w:r>
-        <w:t>,</w:t>
-      </w:r>
+      </w:r>
+      <w:r/>
       <w:r>
         <w:rPr>
           <w:color w:val="0070C0"/>
         </w:rPr>
-        <w:t>10</w:t>
-      </w:r>
-      <w:r>
-        <w:t>–</w:t>
-      </w:r>
+      </w:r>
+      <w:r/>
       <w:r>
         <w:rPr>
           <w:color w:val="0070C0"/>
         </w:rPr>
-        <w:t>13</w:t>
-      </w:r>
-      <w:r>
-        <w:t>]</w:t>
-      </w:r>
-      <w:r>
-        <w:t xml:space="preserve">. The Variable Importance in Projection (VIP) scores, which are derived from the PLS decomposition, provide a principled criterion for selecting the most discriminative spectral variables and are commonly employed as a </w:t>
-      </w:r>
-      <w:proofErr w:type="spellStart"/>
-      <w:r>
-        <w:t>preprocessing</w:t>
-      </w:r>
-      <w:proofErr w:type="spellEnd"/>
-      <w:r>
-        <w:t xml:space="preserve"> step before model training [</w:t>
-      </w:r>
+      </w:r>
+      <w:r/>
+      <w:r/>
+      <w:proofErr w:type="spellStart"/>
+      <w:r/>
+      <w:proofErr w:type="spellEnd"/>
+      <w:r/>
       <w:r>
         <w:rPr>
           <w:color w:val="0070C0"/>
         </w:rPr>
-        <w:t>8</w:t>
-      </w:r>
-      <w:r>
-        <w:t>]</w:t>
-      </w:r>
-      <w:r>
-        <w:t>.</w:t>
-      </w:r>
-      <w:r>
-        <w:t xml:space="preserve"> In </w:t>
-      </w:r>
-      <w:r>
-        <w:t>literature</w:t>
-      </w:r>
-      <w:r>
-        <w:t>,</w:t>
-      </w:r>
-      <w:r>
-        <w:t xml:space="preserve"> </w:t>
-      </w:r>
-      <w:r>
-        <w:t xml:space="preserve">it </w:t>
-      </w:r>
-      <w:r>
-        <w:t xml:space="preserve">has </w:t>
-      </w:r>
-      <w:r>
-        <w:t xml:space="preserve">been </w:t>
-      </w:r>
-      <w:r>
-        <w:t xml:space="preserve">shown that combining Raman spectroscopy with </w:t>
-      </w:r>
-      <w:r>
-        <w:t>these</w:t>
-      </w:r>
-      <w:r>
-        <w:t xml:space="preserve"> </w:t>
-      </w:r>
-      <w:r>
-        <w:t xml:space="preserve">classifiers can resolve </w:t>
-      </w:r>
-      <w:r>
-        <w:t xml:space="preserve">the </w:t>
-      </w:r>
-      <w:r>
-        <w:t>spectral variations as small as a few percent in relative peak intensity</w:t>
-      </w:r>
-      <w:r>
-        <w:t xml:space="preserve">. </w:t>
-      </w:r>
-      <w:r>
-        <w:t>In such scenarios,</w:t>
-      </w:r>
-      <w:r>
-        <w:t xml:space="preserve"> </w:t>
-      </w:r>
-      <w:r>
-        <w:t>traditional univariate analysis is simply insufficiently sensitive [</w:t>
-      </w:r>
+      </w:r>
+      <w:r/>
+      <w:r/>
+      <w:r/>
+      <w:r/>
+      <w:r/>
+      <w:r/>
+      <w:r/>
+      <w:r/>
+      <w:r/>
+      <w:r/>
+      <w:r/>
+      <w:r/>
+      <w:r/>
+      <w:r/>
+      <w:r/>
+      <w:r/>
+      <w:r/>
+      <w:r/>
+      <w:r/>
       <w:r>
         <w:rPr>
           <w:color w:val="0070C0"/>
         </w:rPr>
-        <w:t>3</w:t>
-      </w:r>
-      <w:r>
-        <w:t>,</w:t>
-      </w:r>
+      </w:r>
+      <w:r/>
       <w:r>
         <w:rPr>
           <w:color w:val="0070C0"/>
         </w:rPr>
-        <w:t>1</w:t>
       </w:r>
       <w:r>
         <w:rPr>
           <w:color w:val="0070C0"/>
         </w:rPr>
-        <w:t>4</w:t>
-      </w:r>
-      <w:r>
-        <w:t>].</w:t>
-      </w:r>
-    </w:p>
-    <w:p>
-      <w:r>
-        <w:t>The selection of PLS-DA and SVM-RBF as the classification frameworks is deliberate and grounded in established chemometric practice for vibrational spectroscopy. PLS-DA is interpretable by design: its latent variable scores, loadings and VIP profiles map directly back to the original spectral variables, enabling mechanistic interpretation of the discriminative features [5,7,8]. SVM-RBF is known to be particularly effective in high-dimensional, small-sample settings — precisely the regime encountered here — where kernel-based decision boundaries avoid the curse of dimensionality that limits linear classifiers [7,10–13]. Methods such as random forests (RF), k-nearest neighbours (KNN) and convolutional neural networks (CNN) are well-established in their own right; however, RF and KNN are vulnerable to the p &gt;&gt; n problem (p ≈ 2200 spectral points, n = 60–80 spectra) without aggressive dimensionality reduction, and CNN-based approaches require substantially larger labelled datasets than those available in a single proof-of-concept spectroscopic study. The VIP–PLS-DA–SVM-RBF pipeline therefore represents the methodological choice best matched to the dataset size and the interpretability requirements of the present study. Comparison with other classifiers is envisaged for future work as the dataset is expanded.</w:t>
-      </w:r>
-    </w:p>
-    <w:p>
-      <w:r>
-        <w:t>The selection of PLS-DA and SVM-RBF as the classification frameworks is deliberate and grounded in established chemometric practice for vibrational spectroscopy. PLS-DA is interpretable by design: its latent variable scores, loadings and VIP profiles map directly back to the original spectral variables, enabling mechanistic interpretation of the discriminative features [5,7,8]. SVM-RBF is known to be particularly effective in high-dimensional, small-sample settings — precisely the regime encountered here — where kernel-based decision boundaries avoid the curse of dimensionality that limits linear classifiers [7,10–13]. Methods such as random forests (RF), k-nearest neighbours (KNN) and convolutional neural networks (CNN) are well-established in their own right. However, RF and KNN are vulnerable to the p &gt;&gt; n problem (here p ≈ 2200 spectral points, n = 60–80 spectra) without aggressive dimensionality reduction, and CNN-based approaches require substantially larger labelled datasets than those available in a single proof-of-concept spectroscopic study. The VIP–PLS-DA–SVM-RBF pipeline therefore represents the methodological choice best matched to the dataset size and the interpretability requirements of the present study. Comparison with other classifiers is envisaged for future work as the dataset is expanded.</w:t>
+      </w:r>
+      <w:r/>
+    </w:p>
+    <w:p>
+      <w:r>
+        <w:t>Among supervised ML classifiers, Partial Least Squares Discriminant Analysis (PLS-DA) and Support Vector Machines with radial basis function kernel (SVM-RBF) are well established for the interpretation of Raman spectroscopic data [5,6]. PLS-DA is a latent variable approach that simultaneously decomposes the spectra and class label matrices to find directions of maximum covariance, yielding interpretable latent variable scores, loading profiles, and Variable Importance in Projection (VIP) scores [1,7,9]. VIP scores, derived from the PLS decomposition, provide a principled criterion for selecting the most discriminative spectral variables and are widely used as a preprocessing step before model training [8]. SVM-RBF finds a maximum-margin classification boundary in a kernel-induced feature space and is known to be robust in high-dimensional, small-sample settings — from biomedical diagnostics to polymer identification [7,10–13]. The selection of these two classifiers over alternatives such as random forests (RF), k-nearest neighbours (KNN), or convolutional neural networks (CNN) is deliberate: RF and KNN are vulnerable to the p &gt;&gt; n problem (p ≈ 2200 spectral points, n = 60–80 spectra) without aggressive dimensionality reduction, while CNN-based approaches require substantially larger labelled datasets than those available in a single proof-of-concept spectroscopic study. The VIP–PLS-DA–SVM-RBF pipeline therefore represents the methodological choice best matched to the dataset size and interpretability requirements of the present study [3,14]. Comparison with other classifiers is envisaged for future work as the dataset is expanded.</w:t>
+      </w:r>
+    </w:p>
+    <w:p>
+      <w:r>
+        <w:t>The choice of Sunset Yellow (SSY) as the model chromonic system rests on several converging reasons. (i) SSY is one of the most extensively characterized LCLCs, with a well-documented phase behaviour, aggregation mechanism, and vibrational spectrum [18–21], providing a reliable benchmark against which spectral assignments and classification outcomes can be validated. (ii) Its plank-like aromatic rigid core and well-resolved Raman-active modes offer a rich and chemically interpretable spectral fingerprint, unlike systems dominated by broad or weakly resolved bands [18,19]. (iii) SSY aggregates are highly sensitive to the physicochemical nature of the underlying surface during solvent evaporation and self-assembly [22], meaning that even minor differences in interfacial chemistry, polarity, and roughness between substrates may meaningfully affect the local vibrational environment of the stacked aromatic cores — changes too subtle to discern by visual inspection but potentially recognisable with ML algorithms [3,14].</w:t>
       </w:r>
     </w:p>
     <w:p>
@@ -1574,170 +1389,87 @@
         <w:jc w:val="both"/>
       </w:pPr>
       <w:r>
-        <w:t>Lyotropic chromonic liquid crystals (LCLCs) are an interesting class of soft matter in which plank-like aromatic molecules, such as dyes, drugs, and nucleic acid derivatives, self-assemble in water into elongated and non-covalently bound stacks [</w:t>
+        <w:t>The presence of a graphene interlayer introduces an additional and mechanistically distinct source of spectral perturbation. Graphene is not a passive, chemically inert spacer; it is an active partner in interfacial vibrational spectroscopy [23]. Non-covalent interactions — π–π stacking and ground-state charge transfer — between adsorbed aromatic molecules and graphene are known to modulate the vibrational response of molecules in close proximity to the graphene layers [23–27]. Since SSY possesses rigid aromatic cores that enable precisely these non-covalent interactions, insertion of graphene between the substrate and the SSY film is expected to modulate the chromonic vibrational fingerprint through a mechanism fundamentally different from the bare-substrate case. The spectral signature of each substrate–graphene combination is therefore expected to encode a distinct interfacial interaction regime, rather than a simple linear superposition of independent substrate and graphene contributions. This motivates a classification scheme capable of distinguishing not only between substrates but also between graphene-coated and bare surface configurations.</w:t>
       </w:r>
       <w:r>
         <w:rPr>
           <w:color w:val="0070C0"/>
         </w:rPr>
-        <w:t>15</w:t>
-      </w:r>
-      <w:r>
-        <w:t xml:space="preserve">]. Unlike conventional amphiphilic systems, </w:t>
-      </w:r>
-      <w:r>
-        <w:lastRenderedPageBreak/>
-        <w:t>LCLCs are intrinsically biocompatible, water-processable, and highly sensitive to ionic strength and interfacial conditions. Consequently, they serve as compelling candidates for biosensing, water-based organic electronics, and optical alignment layers [</w:t>
-      </w:r>
+      </w:r>
+      <w:r/>
+      <w:r/>
       <w:r>
         <w:rPr>
           <w:color w:val="0070C0"/>
         </w:rPr>
-        <w:t>15</w:t>
-      </w:r>
-      <w:r>
-        <w:t>,</w:t>
-      </w:r>
+      </w:r>
+      <w:r/>
       <w:r>
         <w:rPr>
           <w:color w:val="0070C0"/>
         </w:rPr>
-        <w:t>16</w:t>
-      </w:r>
-      <w:r>
-        <w:t>].</w:t>
-      </w:r>
-      <w:r>
-        <w:t xml:space="preserve"> </w:t>
-      </w:r>
-      <w:r>
-        <w:t xml:space="preserve">In particular, the alignment of these kind of materials is fundamental for technical applications </w:t>
-      </w:r>
+      </w:r>
+      <w:r/>
+      <w:r/>
+      <w:r/>
       <w:bookmarkStart w:id="0" w:name="_Hlk233796060"/>
-      <w:r>
-        <w:t>[</w:t>
-      </w:r>
+      <w:r/>
       <w:r>
         <w:rPr>
           <w:color w:val="0070C0"/>
         </w:rPr>
-        <w:t>17</w:t>
-      </w:r>
-      <w:r>
-        <w:t xml:space="preserve">]. </w:t>
-      </w:r>
+      </w:r>
+      <w:r/>
       <w:bookmarkEnd w:id="0"/>
-      <w:r>
-        <w:t xml:space="preserve">Raman spectroscopy offers a </w:t>
-      </w:r>
-      <w:r>
-        <w:t>particularly</w:t>
-      </w:r>
-      <w:r>
-        <w:t xml:space="preserve"> </w:t>
-      </w:r>
-      <w:r>
-        <w:t xml:space="preserve">informative probe in the </w:t>
-      </w:r>
-      <w:r>
-        <w:t xml:space="preserve">specific </w:t>
-      </w:r>
-      <w:r>
-        <w:t>context of</w:t>
-      </w:r>
-      <w:r>
-        <w:t xml:space="preserve"> </w:t>
-      </w:r>
-      <w:r>
-        <w:t xml:space="preserve">LC </w:t>
-      </w:r>
-      <w:r>
-        <w:t xml:space="preserve">self-assembly </w:t>
-      </w:r>
-      <w:r>
-        <w:t>because the vibrational fingerprint</w:t>
-      </w:r>
-      <w:r>
-        <w:t>s</w:t>
-      </w:r>
-      <w:r>
-        <w:t xml:space="preserve"> of the constituent molecules </w:t>
-      </w:r>
-      <w:r>
-        <w:t>are</w:t>
-      </w:r>
-      <w:r>
-        <w:t xml:space="preserve"> sensitive not only to their intrinsic chemical structure but also to their local packing environment, intermolecular interactions</w:t>
-      </w:r>
-      <w:r>
-        <w:t xml:space="preserve"> </w:t>
-      </w:r>
-      <w:r>
-        <w:t>and degree of orientational order</w:t>
-      </w:r>
-      <w:r>
-        <w:t>.</w:t>
-      </w:r>
-      <w:r>
-        <w:t xml:space="preserve"> </w:t>
-      </w:r>
-      <w:r>
-        <w:t xml:space="preserve">Previously conducted studies have </w:t>
-      </w:r>
-      <w:r>
-        <w:t>also reported the orientational order parameters in LCLCs and detailed self-assembly kinetics of chromonic dyes in aqueous solution [</w:t>
-      </w:r>
+      <w:r/>
+      <w:r/>
+      <w:r/>
+      <w:r/>
+      <w:r/>
+      <w:r/>
+      <w:r/>
+      <w:r/>
+      <w:r/>
+      <w:r/>
+      <w:r/>
+      <w:r/>
+      <w:r/>
+      <w:r/>
+      <w:r/>
+      <w:r/>
+      <w:r/>
+      <w:r/>
+      <w:r/>
+      <w:r/>
       <w:r>
         <w:rPr>
           <w:color w:val="0070C0"/>
         </w:rPr>
-        <w:t>1</w:t>
       </w:r>
       <w:r>
         <w:rPr>
           <w:color w:val="0070C0"/>
         </w:rPr>
-        <w:t>8</w:t>
-      </w:r>
-      <w:r>
-        <w:t>,</w:t>
-      </w:r>
+      </w:r>
+      <w:r/>
       <w:r>
         <w:rPr>
           <w:color w:val="0070C0"/>
         </w:rPr>
-        <w:t>1</w:t>
       </w:r>
       <w:r>
         <w:rPr>
           <w:color w:val="0070C0"/>
         </w:rPr>
-        <w:t>9</w:t>
-      </w:r>
-      <w:r>
-        <w:t>]</w:t>
-      </w:r>
-      <w:r>
-        <w:t xml:space="preserve">. </w:t>
-      </w:r>
-      <w:r>
-        <w:t xml:space="preserve">These studies </w:t>
-      </w:r>
-      <w:r>
-        <w:t>found</w:t>
-      </w:r>
-      <w:r>
-        <w:t xml:space="preserve"> that Raman spectroscopy is sensitive to the supramolecular organization of chromonic aggregates well beyond what is captured by their nominal chemical composition</w:t>
-      </w:r>
-      <w:r>
-        <w:t>, indeed,</w:t>
-      </w:r>
-      <w:r>
-        <w:t xml:space="preserve"> the property exploited in the present classification framework</w:t>
-      </w:r>
-      <w:r>
-        <w:t xml:space="preserve">. </w:t>
-      </w:r>
+      </w:r>
+      <w:r/>
+      <w:r/>
+      <w:r/>
+      <w:r/>
+      <w:r/>
+      <w:r/>
+      <w:r/>
+      <w:r/>
     </w:p>
     <w:p>
       <w:pPr>
@@ -1745,563 +1477,141 @@
         <w:jc w:val="both"/>
       </w:pPr>
       <w:r>
-        <w:t xml:space="preserve">The choice of </w:t>
-      </w:r>
-      <w:r>
-        <w:t xml:space="preserve">Sunset Yellow </w:t>
-      </w:r>
-      <w:r>
-        <w:t xml:space="preserve">(SSY) as a model chromonic system in the present study </w:t>
-      </w:r>
-      <w:r>
-        <w:t>lies</w:t>
-      </w:r>
-      <w:r>
-        <w:t xml:space="preserve"> in several converging reasons. </w:t>
-      </w:r>
-      <w:r>
-        <w:t>(</w:t>
-      </w:r>
-      <w:proofErr w:type="spellStart"/>
-      <w:r>
-        <w:t>i</w:t>
-      </w:r>
-      <w:proofErr w:type="spellEnd"/>
-      <w:r>
-        <w:t xml:space="preserve">) </w:t>
-      </w:r>
-      <w:r>
-        <w:t xml:space="preserve">SSY is one of the most extensively characterized </w:t>
-      </w:r>
-      <w:r>
-        <w:t>LCLC</w:t>
-      </w:r>
-      <w:r>
-        <w:t>s, with a well-documented phase behaviour, aggregation mechanism, and vibrational spectrum [</w:t>
-      </w:r>
+        <w:t>Collectively, the above considerations frame the present study as more than a methodological comparison between two ML models. The fundamental scientific question is whether ML-integrated Raman analysis can detect and discriminate the interface-dependent differences in the self-organisation of SSY arising from substrate chemistry and the presence of a graphene interlayer, particularly when such differences are invisible to direct visual inspection or conventional peak-to-peak comparison. The innovation of the present work is threefold: (i) it is among the first studies to apply a VIP–PLS-DA–SVM-RBF classification pipeline to substrate-resolved Raman spectra of a LCLC film; (ii) it systematically quantifies how VIP-based feature reduction affects model generalisation for this class of materials; and (iii) it demonstrates that the graphene interlayer introduces a structurally coherent spectral perturbation that is learnable by PLS-DA with high, VIP-threshold-independent accuracy. To this end, SSY was deposited on four substrate configurations: (i) bare polydimethylsiloxane (PDMS), (ii) graphene-coated PDMS, (iii) bare SiO₂/Si, and (iv) graphene-coated SiO₂/Si. Both classifiers were evaluated under a four-class and a binary (PDMS vs. SiO₂/Si) formulation, with VIP-based variable selection systematically varied across {1000, 1500, 1800, 2200} variables. This controlled scope is pivotal to establishing a rigorous proof of concept for ML-integrated Raman classification of chromonic self-organisation on different substrates.</w:t>
+      </w:r>
+      <w:r/>
+      <w:r/>
+      <w:r/>
+      <w:r/>
+      <w:r/>
+      <w:proofErr w:type="spellStart"/>
+      <w:r/>
+      <w:proofErr w:type="spellEnd"/>
+      <w:r/>
+      <w:r/>
+      <w:r/>
+      <w:r/>
       <w:r>
         <w:rPr>
           <w:color w:val="0070C0"/>
         </w:rPr>
-        <w:t>1</w:t>
       </w:r>
       <w:r>
         <w:rPr>
           <w:color w:val="0070C0"/>
         </w:rPr>
-        <w:t>8</w:t>
-      </w:r>
-      <w:r>
-        <w:t>–</w:t>
-      </w:r>
+      </w:r>
+      <w:r/>
       <w:r>
         <w:rPr>
           <w:color w:val="0070C0"/>
         </w:rPr>
-        <w:t>2</w:t>
       </w:r>
       <w:r>
         <w:rPr>
           <w:color w:val="0070C0"/>
         </w:rPr>
-        <w:t>1</w:t>
-      </w:r>
-      <w:r>
-        <w:t>]</w:t>
-      </w:r>
-      <w:r>
-        <w:t>.</w:t>
-      </w:r>
-      <w:r>
-        <w:t xml:space="preserve"> </w:t>
-      </w:r>
-      <w:r>
-        <w:t>This provides</w:t>
-      </w:r>
-      <w:r>
-        <w:t xml:space="preserve"> a reliable benchmark against which spectral assignments and classification outcomes can be validated. </w:t>
-      </w:r>
-      <w:r>
-        <w:t xml:space="preserve">(ii) </w:t>
-      </w:r>
-      <w:r>
-        <w:t>Unlike systems whose Raman response is dominated by broad, overlapping, or weakly resolved bands, i</w:t>
-      </w:r>
-      <w:r>
-        <w:t xml:space="preserve">ts plank-like aromatic rigid core and </w:t>
-      </w:r>
-      <w:r>
-        <w:t>well-resolved</w:t>
-      </w:r>
-      <w:r>
-        <w:t xml:space="preserve"> Raman</w:t>
-      </w:r>
-      <w:r>
-        <w:t xml:space="preserve"> active modes offer a rich and chemically interpretable spectral fingerprint</w:t>
-      </w:r>
-      <w:r>
-        <w:t xml:space="preserve"> [</w:t>
-      </w:r>
+      </w:r>
+      <w:r/>
+      <w:r/>
+      <w:r/>
+      <w:r/>
+      <w:r/>
+      <w:r/>
+      <w:r/>
+      <w:r/>
+      <w:r/>
+      <w:r/>
+      <w:r/>
+      <w:r/>
       <w:r>
         <w:rPr>
           <w:color w:val="0070C0"/>
         </w:rPr>
-        <w:t>1</w:t>
       </w:r>
       <w:r>
         <w:rPr>
           <w:color w:val="0070C0"/>
         </w:rPr>
-        <w:t>8</w:t>
-      </w:r>
-      <w:r>
-        <w:t>,</w:t>
-      </w:r>
+      </w:r>
+      <w:r/>
       <w:r>
         <w:rPr>
           <w:color w:val="0070C0"/>
         </w:rPr>
-        <w:t>1</w:t>
       </w:r>
       <w:r>
         <w:rPr>
           <w:color w:val="0070C0"/>
         </w:rPr>
-        <w:t>9</w:t>
-      </w:r>
-      <w:r>
-        <w:t>]</w:t>
-      </w:r>
-      <w:r>
-        <w:t xml:space="preserve">. (iii) SSY aggregates are </w:t>
-      </w:r>
-      <w:r>
-        <w:t>proven</w:t>
-      </w:r>
-      <w:r>
-        <w:t xml:space="preserve"> to be highly sensitive to the physicochemical nature of the underlying surface during solvent evaporation and self-</w:t>
-      </w:r>
-      <w:r>
-        <w:t xml:space="preserve"> </w:t>
-      </w:r>
-      <w:r>
-        <w:t xml:space="preserve">assembly </w:t>
-      </w:r>
+      </w:r>
+      <w:r/>
+      <w:r/>
+      <w:r/>
+      <w:r/>
+      <w:r/>
+      <w:r/>
       <w:r>
         <w:rPr>
           <w:color w:val="000000" w:themeColor="text1"/>
         </w:rPr>
-        <w:t>[</w:t>
       </w:r>
       <w:r>
         <w:rPr>
           <w:color w:val="0070C0"/>
         </w:rPr>
-        <w:t>2</w:t>
       </w:r>
       <w:r>
         <w:rPr>
           <w:color w:val="0070C0"/>
         </w:rPr>
-        <w:t>2</w:t>
       </w:r>
       <w:r>
         <w:rPr>
           <w:color w:val="000000" w:themeColor="text1"/>
         </w:rPr>
-        <w:t xml:space="preserve">]. </w:t>
       </w:r>
       <w:r>
         <w:rPr>
           <w:color w:val="000000" w:themeColor="text1"/>
         </w:rPr>
-        <w:t xml:space="preserve"> </w:t>
-      </w:r>
-      <w:r>
-        <w:t>This means that</w:t>
-      </w:r>
-      <w:r>
-        <w:t>, in principle,</w:t>
-      </w:r>
-      <w:r>
-        <w:t xml:space="preserve"> even m</w:t>
-      </w:r>
-      <w:r>
-        <w:t>inor</w:t>
-      </w:r>
-      <w:r>
-        <w:t xml:space="preserve"> differences in interfacial chemistry</w:t>
-      </w:r>
-      <w:r>
-        <w:t xml:space="preserve">, polarity, and roughness between the substrates may </w:t>
-      </w:r>
-      <w:r>
-        <w:t>meaningfully affect</w:t>
-      </w:r>
-      <w:r>
-        <w:t xml:space="preserve"> the local vibrational environment of the stacked aromatic cores</w:t>
-      </w:r>
-      <w:r>
-        <w:t>.</w:t>
-      </w:r>
-      <w:r>
-        <w:t xml:space="preserve"> This </w:t>
-      </w:r>
-      <w:r>
-        <w:t xml:space="preserve">may be too subtle to discern by </w:t>
-      </w:r>
-      <w:r>
-        <w:t>visual inspection</w:t>
-      </w:r>
-      <w:r>
-        <w:t xml:space="preserve"> but potentially reco</w:t>
-      </w:r>
-      <w:r>
-        <w:t>gnisable</w:t>
-      </w:r>
-      <w:r>
-        <w:t xml:space="preserve"> </w:t>
-      </w:r>
-      <w:r>
-        <w:t>with</w:t>
-      </w:r>
-      <w:r>
-        <w:t xml:space="preserve"> </w:t>
-      </w:r>
-      <w:r>
-        <w:t xml:space="preserve">ML algorithms </w:t>
-      </w:r>
-      <w:r>
-        <w:t>[</w:t>
-      </w:r>
+      </w:r>
+      <w:r/>
+      <w:r/>
+      <w:r/>
+      <w:r/>
+      <w:r/>
+      <w:r/>
+      <w:r/>
+      <w:r/>
+      <w:r/>
+      <w:r/>
+      <w:r/>
+      <w:r/>
+      <w:r/>
+      <w:r/>
+      <w:r/>
+      <w:r/>
+      <w:r/>
+      <w:r/>
+      <w:r/>
       <w:r>
         <w:rPr>
           <w:color w:val="0070C0"/>
         </w:rPr>
-        <w:t>3</w:t>
-      </w:r>
-      <w:r>
-        <w:t>,</w:t>
-      </w:r>
+      </w:r>
+      <w:r/>
       <w:r>
         <w:rPr>
           <w:color w:val="0070C0"/>
         </w:rPr>
-        <w:t>1</w:t>
       </w:r>
       <w:r>
         <w:rPr>
           <w:color w:val="0070C0"/>
         </w:rPr>
-        <w:t>4</w:t>
-      </w:r>
-      <w:r>
-        <w:t>].</w:t>
-      </w:r>
-    </w:p>
-    <w:p>
-      <w:pPr>
-        <w:spacing w:after="200"/>
-        <w:jc w:val="both"/>
-      </w:pPr>
-      <w:r>
-        <w:t xml:space="preserve">The presence of a graphene interlayer introduces an additional and mechanistically distinct source of spectral perturbation.  </w:t>
-      </w:r>
-      <w:r>
-        <w:t>Graphene is not just considered as a passive and chemically inert spacer but recognized as</w:t>
-      </w:r>
-      <w:r>
-        <w:t xml:space="preserve"> </w:t>
-      </w:r>
-      <w:r>
-        <w:t>an active partner in interfacial vibrational spectroscopy</w:t>
-      </w:r>
-      <w:r>
-        <w:t xml:space="preserve"> </w:t>
-      </w:r>
-      <w:r>
-        <w:t>[</w:t>
-      </w:r>
-      <w:r>
-        <w:rPr>
-          <w:color w:val="0070C0"/>
-        </w:rPr>
-        <w:t>23</w:t>
-      </w:r>
-      <w:r>
-        <w:t>]</w:t>
-      </w:r>
-      <w:r>
-        <w:t>.</w:t>
-      </w:r>
-      <w:r>
-        <w:t xml:space="preserve"> Moreover, non-covalent</w:t>
-      </w:r>
-      <w:r>
-        <w:t xml:space="preserve"> interactions </w:t>
-      </w:r>
-      <w:r>
-        <w:t xml:space="preserve">(π–π stacking and ground-state charge transfer) </w:t>
-      </w:r>
-      <w:r>
-        <w:t xml:space="preserve">between adsorbed aromatic molecules and graphene </w:t>
-      </w:r>
-      <w:r>
-        <w:t>are known to modulate the vibrational response of molecules in close proximity to the graphene layers [</w:t>
-      </w:r>
-      <w:r>
-        <w:rPr>
-          <w:color w:val="0070C0"/>
-        </w:rPr>
-        <w:t>2</w:t>
-      </w:r>
-      <w:r>
-        <w:rPr>
-          <w:color w:val="0070C0"/>
-        </w:rPr>
-        <w:t>3</w:t>
-      </w:r>
-      <w:r>
-        <w:t>–</w:t>
-      </w:r>
-      <w:r>
-        <w:rPr>
-          <w:color w:val="0070C0"/>
-        </w:rPr>
-        <w:t>2</w:t>
-      </w:r>
-      <w:r>
-        <w:rPr>
-          <w:color w:val="0070C0"/>
-        </w:rPr>
-        <w:t>7</w:t>
-      </w:r>
-      <w:r>
-        <w:t>]. Since SSY is also comprised of rigid aromatic core</w:t>
-      </w:r>
-      <w:r>
-        <w:t>s enabling this type of non-covalent interactions</w:t>
-      </w:r>
-      <w:r>
-        <w:t>,</w:t>
-      </w:r>
-      <w:r>
-        <w:t xml:space="preserve"> and the insertion of graphene between the substrate and SSY is expected to modulate the vibrational fingerprint of the chromonic aggregates</w:t>
-      </w:r>
-      <w:r>
-        <w:t xml:space="preserve"> via a mechanism basically different from the bare-substrate case. </w:t>
-      </w:r>
-      <w:r>
-        <w:t xml:space="preserve">This motivates a classification scheme capable of distinguishing not only between substrates but </w:t>
-      </w:r>
-      <w:r>
-        <w:t xml:space="preserve">also </w:t>
-      </w:r>
-      <w:r>
-        <w:t>between substrates with and without a graphene interlayer</w:t>
-      </w:r>
-      <w:r>
-        <w:t>. Because</w:t>
-      </w:r>
-      <w:r>
-        <w:t xml:space="preserve"> the spectral signature of each combination is expected to encode a distinct interfacial interaction regime rather than a simple linear superposition of independent effects.</w:t>
-      </w:r>
-    </w:p>
-    <w:p>
-      <w:pPr>
-        <w:spacing w:after="200"/>
-        <w:jc w:val="both"/>
-      </w:pPr>
-      <w:r>
-        <w:t>Collectively, these considerations reframe the present study as more than a methodological comparison between two ML models. The fundamental scientific question is whether ML-integrated Raman analysis can detect and discriminate the interface-dependent differences in self-organisation of SSY arising from the presence of a graphene interlayer and from substrate chemistry — particularly when such differences are not evident from direct visual inspection or conventional peak-to-peak comparison. The innovation of the present work is therefore threefold: (i) it is the first study to apply a VIP–PLS-DA–SVM-RBF classification pipeline to substrate-resolved Raman spectra of a LCLC film; (ii) it systematically quantifies how VIP-based feature reduction affects model generalisation for this class of materials; and (iii) it demonstrates that the graphene interlayer introduces a structurally coherent spectral perturbation that is learnable by PLS-DA with high and VIP-threshold-independent accuracy. In this scenario, PLS-DA and SVM-RBF are employed not merely as competing classifiers but as complementary analytical lenses: the former is variance- and interpretability-oriented, whereas the latter is geometrically motivated [28].</w:t>
-      </w:r>
-      <w:r/>
-      <w:r/>
-      <w:r/>
-      <w:r/>
-      <w:r/>
-      <w:r/>
-      <w:r/>
-      <w:r/>
-      <w:r/>
-      <w:r/>
-      <w:r/>
-      <w:r/>
-      <w:r/>
-      <w:r/>
-      <w:r/>
-      <w:r/>
-      <w:r/>
-      <w:r>
-        <w:rPr>
-          <w:color w:val="0070C0"/>
-        </w:rPr>
-      </w:r>
-      <w:r>
-        <w:rPr>
-          <w:color w:val="0070C0"/>
-        </w:rPr>
-      </w:r>
-      <w:r/>
-    </w:p>
-    <w:p>
-      <w:pPr>
-        <w:spacing w:after="200"/>
-        <w:jc w:val="both"/>
-      </w:pPr>
-      <w:r>
-        <w:t>Notably, the present study was conducted on a single nematic chromonic liquid crystal (SSY) tested against a defined set of substrates and interlayer configuration</w:t>
-      </w:r>
-      <w:r>
-        <w:t xml:space="preserve">s, </w:t>
-      </w:r>
-      <w:r>
-        <w:t xml:space="preserve">namely: </w:t>
-      </w:r>
-      <w:r>
-        <w:t>(</w:t>
-      </w:r>
-      <w:proofErr w:type="spellStart"/>
-      <w:r>
-        <w:t>i</w:t>
-      </w:r>
-      <w:proofErr w:type="spellEnd"/>
-      <w:r>
-        <w:t>)</w:t>
-      </w:r>
-      <w:r>
-        <w:t xml:space="preserve"> bare </w:t>
-      </w:r>
-      <w:r>
-        <w:t>polydimethylsiloxane (</w:t>
-      </w:r>
-      <w:r>
-        <w:t>PDMS</w:t>
-      </w:r>
-      <w:r>
-        <w:t>)</w:t>
-      </w:r>
-      <w:r>
-        <w:t xml:space="preserve">, </w:t>
-      </w:r>
-      <w:r>
-        <w:t>(</w:t>
-      </w:r>
-      <w:r>
-        <w:t>ii</w:t>
-      </w:r>
-      <w:r>
-        <w:t>)</w:t>
-      </w:r>
-      <w:r>
-        <w:t xml:space="preserve"> graphene-coated PDMS, </w:t>
-      </w:r>
-      <w:r>
-        <w:t>(</w:t>
-      </w:r>
-      <w:r>
-        <w:t>iii</w:t>
-      </w:r>
-      <w:r>
-        <w:t>)</w:t>
-      </w:r>
-      <w:r>
-        <w:t xml:space="preserve"> bare</w:t>
-      </w:r>
-      <w:r>
-        <w:t xml:space="preserve"> silicon oxide (</w:t>
-      </w:r>
-      <w:r>
-        <w:t>SiO</w:t>
-      </w:r>
-      <w:r>
-        <w:rPr>
-          <w:vertAlign w:val="subscript"/>
-        </w:rPr>
-        <w:t>2</w:t>
-      </w:r>
-      <w:r>
-        <w:t>/Si</w:t>
-      </w:r>
-      <w:r>
-        <w:t>)</w:t>
-      </w:r>
-      <w:r>
-        <w:t xml:space="preserve"> and </w:t>
-      </w:r>
-      <w:r>
-        <w:t>(</w:t>
-      </w:r>
-      <w:r>
-        <w:t>iv</w:t>
-      </w:r>
-      <w:r>
-        <w:t>)</w:t>
-      </w:r>
-      <w:r>
-        <w:t xml:space="preserve"> graphene-coated SiO</w:t>
-      </w:r>
-      <w:r>
-        <w:rPr>
-          <w:vertAlign w:val="subscript"/>
-        </w:rPr>
-        <w:t>2</w:t>
-      </w:r>
-      <w:r>
-        <w:t>/Si</w:t>
-      </w:r>
-      <w:r>
-        <w:t xml:space="preserve">. Both classifiers were tested under the four-class as well as the binary </w:t>
-      </w:r>
-      <w:r>
-        <w:t>(PDMS vs. SiO2/Si)</w:t>
-      </w:r>
-      <w:r>
-        <w:t xml:space="preserve"> formulations</w:t>
-      </w:r>
-      <w:r>
-        <w:t xml:space="preserve">. </w:t>
-      </w:r>
-      <w:r>
-        <w:t xml:space="preserve">A key objective </w:t>
-      </w:r>
-      <w:r>
-        <w:t>was</w:t>
-      </w:r>
-      <w:r>
-        <w:t xml:space="preserve"> to quantify the influence of VIP-based variable selection (top 1000, 1500, 1800 and 2200 variables) on cross-validation and external test performance, and to assess the role played by the graphene interlayer in terms of model generalisation.</w:t>
-      </w:r>
-      <w:r>
-        <w:t xml:space="preserve"> Nevertheless, this controlled scope is pivotal to </w:t>
-      </w:r>
-      <w:r>
-        <w:t>establishing</w:t>
-      </w:r>
-      <w:r>
-        <w:t xml:space="preserve"> a rigorous proof of concept for ML-integrated Raman classification</w:t>
-      </w:r>
-      <w:r>
-        <w:t xml:space="preserve"> of </w:t>
-      </w:r>
-      <w:proofErr w:type="spellStart"/>
-      <w:r>
-        <w:t>chromonics</w:t>
-      </w:r>
-      <w:proofErr w:type="spellEnd"/>
-      <w:r>
-        <w:t xml:space="preserve"> self-organized on different substrates. Consequently, whether these findings hold true for other chromonic systems such as disodium cromoglycate </w:t>
-      </w:r>
-      <w:r>
-        <w:t xml:space="preserve">or other </w:t>
-      </w:r>
-      <w:proofErr w:type="spellStart"/>
-      <w:r>
-        <w:t>chromonics</w:t>
-      </w:r>
-      <w:proofErr w:type="spellEnd"/>
-      <w:r>
-        <w:t xml:space="preserve"> with different aromatic core geometries remains an open question.</w:t>
-      </w:r>
+      </w:r>
+      <w:r/>
     </w:p>
     <w:p>
       <w:pPr>

</xml_diff>

<commit_message>
Correct spectral range from 450 to 500 cm⁻¹ throughout manuscript
- Section 3.1: range corrected to 500–1800 cm⁻¹; removed 460–490 cm⁻¹
  band assignment (below actual measurement range); out-of-plane skeletal
  region now starts at 500 cm⁻¹ with SO₃⁻ deformation at 530–560 cm⁻¹
  as the first assigned band
- Methods 2.2: spectral crop range corrected to 500–1800 cm⁻¹
- Figure 1 caption: range corrected to 500–1800 cm⁻¹

Co-Authored-By: Claude Sonnet 4.6 <noreply@anthropic.com>
Claude-Session: https://claude.ai/code/session_01MNVMUP3XQfcv4xQxHGe3PS
</commit_message>
<xml_diff>
--- a/MANUSCRIPT-SpectroActaPartA-FAGGIO_revised.docx
+++ b/MANUSCRIPT-SpectroActaPartA-FAGGIO_revised.docx
@@ -1769,7 +1769,7 @@
         <w:jc w:val="both"/>
       </w:pPr>
       <w:r>
-        <w:t>All data analysis was performed in Python (v3.x) version. Raw Raman spectra were cropped to the significant spectral region (450–1800 cm⁻¹) and then smoothed by Savitzky–Golay filtering (window = 7 points, polynomial order = 2) implemented in SciPy. Variable importance in projection (VIP) scores were computed from a preliminary 3-component PLS model fitted exclusively on scaled (zero mean, unit variance) training data. We kept the top-N highest-VIP variables for the training of the models, where N ∈ {1000, 1500, 1800, 2200}. All scaling and VIP calculation were performed only on training data to avoid information leakage. The specific thresholds N ∈ {1000, 1500, 1800, 2200} were chosen to systematically probe the sensitivity of model performance to the size of the VIP-selected feature space, ranging from a conservative selection (1000 variables, approximately 44.9% of the 2228-point spectral window, close to the number of variables exceeding VIP &gt; 1 in the preliminary model) to a near-complete retention (2200 variables, 98.7%). This range was designed to bracket the conventional VIP &gt; 1 cutoff and assess whether stricter or more permissive selections systematically alter classification outcomes.</w:t>
+        <w:t>All data analysis was performed in Python (v3.x) version. Raw Raman spectra were cropped to the significant spectral region (500–1800 cm⁻¹) and then smoothed by Savitzky–Golay filtering (window = 7 points, polynomial order = 2) implemented in SciPy. Variable importance in projection (VIP) scores were computed from a preliminary 3-component PLS model fitted exclusively on scaled (zero mean, unit variance) training data. We kept the top-N highest-VIP variables for the training of the models, where N ∈ {1000, 1500, 1800, 2200}. All scaling and VIP calculation were performed only on training data to avoid information leakage. The specific thresholds N ∈ {1000, 1500, 1800, 2200} were chosen to systematically probe the sensitivity of model performance to the size of the VIP-selected feature space, ranging from a conservative selection (1000 variables, approximately 44.9% of the 2228-point spectral window, close to the number of variables exceeding VIP &gt; 1 in the preliminary model) to a near-complete retention (2200 variables, 98.7%). This range was designed to bracket the conventional VIP &gt; 1 cutoff and assess whether stricter or more permissive selections systematically alter classification outcomes.</w:t>
       </w:r>
       <w:r/>
       <w:r/>
@@ -2064,7 +2064,7 @@
           <w:rFonts w:eastAsia="MS Mincho"/>
           <w:lang w:val="en-US" w:eastAsia="en-US"/>
         </w:rPr>
-        <w:t>Figure 1 depicts the mean Raman spectra of four SSY substrate configurations in the range of 450–1800 cm⁻¹ over 80 measurements (±1 standard deviation, grey shading), plotted as a function of Raman shift (cm⁻¹). All dominant Raman bands are consistent with the literature for the keto-hydrazone tautomer of SSY, which dominates in the condensed film state [18,19,29]. The complete vibrational assignment, organised by spectral region, is as follows. In the out-of-plane skeletal region (450–700 cm⁻¹), the weak but reproducible bands arise from low-frequency collective motions of the molecular framework. Bands in the 460–490 cm⁻¹ range are attributed to out-of-plane ring deformation modes (γ ring) of the naphthalene (R1) system, corresponding to the wagging and torsion of the aromatic backbone characteristic of the keto-hydrazone geometry [19,21]. The features observed around 530–560 cm⁻¹ are assigned to the symmetric SO₃⁻ deformation (δₛ SO₃⁻) and out-of-plane ring torsion, reflecting the sulfonation pattern on the naphthalene ring [18,19]. Bands in the 580–630 cm⁻¹ range are attributed to C–S stretching coupled with ring skeletal bending, while the 640–680 cm⁻¹ region encompasses C–H out-of-plane bending (γ C–H) of both the naphthalene (R1) and phenyl (R2) rings [19,21]. The C–H out-of-plane deformation and ring breathing region (700–1000 cm⁻¹) contains bands most sensitive to the ring substitution pattern and the tautomeric configuration. Bands near 700–730 cm⁻¹ are assigned to C–H out-of-plane wagging of the naphthalene ring coupled with ring skeletal deformation [19,21]. The spectral feature at 770–800 cm⁻¹ corresponds to the naphthalene ring breathing mode, together with C–H out-of-plane bending of the peri-substituted aromatic positions [18,19]. Bands around 830–870 cm⁻¹ arise from ring deformation and C–H out-of-plane bending of the para-substituted phenyl ring (R2) [19,21]. Importantly, the feature at approximately 960–990 cm⁻¹ is assigned to the N–N stretching vibration of the hydrazone linkage (ν N–N, hydrazone form), a band diagnostic of the keto-hydrazone tautomer that would be absent or shifted in the azo form [19]. Its presence thus confirms the hydrazone character of SSY in the deposited films across all four substrate configurations. In the 1000–1090 cm⁻¹ range, the observed bands are assigned to ring trigonal bending, C–H in-plane bending and skeletal ring vibrations, consistent with the in-plane deformation modes of the conjugated naphthalene–hydrazone–phenyl framework [18,19,29]. The fingerprint region I (1094–1229 cm⁻¹) encompasses bending and deformation vibration modes of the naphthalene (R1) and phenyl (R2) rings at 1094 and 1127 cm⁻¹, respectively, alongside SO₃ group activity and C–N stretching coupled with N–H and naphthalene deformation modes at 1182 and 1229 cm⁻¹, collectively reflecting the stability of the sulfonate substituents on all examined substrates [18,19,29]. In the fingerprint region II (1335–1480 cm⁻¹), vibrational modes of the naphthalene and phenyl rings coexist with C–N, N–H and N–N stretching contributions of the hydrazone tautomer, characteristic of the hydrazone linkage and the extended aromatic core of SSY [18,19]. The D band of graphene (∼1350 cm⁻¹) coincides with this N–N/C–N hydrazone stretching region in the graphene-coated spectra. In the high-frequency region (1501–1598 cm⁻¹), the bands at 1501 and 1549 cm⁻¹ arise from C=O and C–N stretching coupled with N–H in-plane bending and naphthalene skeletal vibrations, respectively, where the C=O stretching is a hallmark of the keto-hydrazone tautomeric form [18,19]. The most intense band at 1598 cm⁻¹ is assigned to symmetric C–C stretching of the naphthalene (R1) and phenyl (R2) rings, reflecting the extended π-conjugation of the SSY chromophore [18,19]. The graphene G band (∼1580 cm⁻¹) is superimposed on this region in the Gr-coated spectra and partially overlaps with the 1598 cm⁻¹ SSY band. By visual inspection, all four SSY spectra are virtually indistinguishable across the entire 450–1800 cm⁻¹ window despite the substrate-dependent interfacial environments. This high spectral similarity across classes constitutes the fundamental analytical challenge and motivates the machine learning approach described in the following sections.</w:t>
+        <w:t>Figure 1 depicts the mean Raman spectra of four SSY substrate configurations in the range of 500–1800 cm⁻¹ over 80 measurements (±1 standard deviation, grey shading), plotted as a function of Raman shift (cm⁻¹). All dominant Raman bands are consistent with the literature for the keto-hydrazone tautomer of SSY, which dominates in the condensed film state [18,19,29]. The complete vibrational assignment, organised by spectral region, is as follows. In the out-of-plane skeletal region (500–700 cm⁻¹), the weak but reproducible bands arise from low-frequency collective motions of the molecular framework. Bands in the 530–560 cm⁻¹ range are assigned to the symmetric SO₃⁻ deformation (δₛ SO₃⁻) and out-of-plane ring torsion of the naphthalene (R1) system, reflecting the sulfonation pattern characteristic of the keto-hydrazone geometry [18,19]. Bands in the 580–630 cm⁻¹ range are attributed to C–S stretching coupled with ring skeletal bending, while the 640–680 cm⁻¹ region encompasses C–H out-of-plane bending (γ C–H) of both the naphthalene (R1) and phenyl (R2) rings [19,21]. The C–H out-of-plane deformation and ring breathing region (700–1000 cm⁻¹) contains bands most sensitive to the ring substitution pattern and the tautomeric configuration. Bands near 700–730 cm⁻¹ are assigned to C–H out-of-plane wagging of the naphthalene ring coupled with ring skeletal deformation [19,21]. The spectral feature at 770–800 cm⁻¹ corresponds to the naphthalene ring breathing mode, together with C–H out-of-plane bending of the peri-substituted aromatic positions [18,19]. Bands around 830–870 cm⁻¹ arise from ring deformation and C–H out-of-plane bending of the para-substituted phenyl ring (R2) [19,21]. Importantly, the feature at approximately 960–990 cm⁻¹ is assigned to the N–N stretching vibration of the hydrazone linkage (ν N–N, hydrazone form), a band diagnostic of the keto-hydrazone tautomer that would be absent or shifted in the azo form [19]. Its presence confirms the hydrazone character of SSY in the deposited films across all four substrate configurations. In the 1000–1090 cm⁻¹ range, the observed bands are assigned to ring trigonal bending, C–H in-plane bending and skeletal ring vibrations, consistent with the in-plane deformation modes of the conjugated naphthalene–hydrazone–phenyl framework [18,19,29]. The fingerprint region I (1094–1229 cm⁻¹) encompasses bending and deformation vibration modes of the naphthalene (R1) and phenyl (R2) rings at 1094 and 1127 cm⁻¹, respectively, alongside SO₃ group activity and C–N stretching coupled with N–H and naphthalene deformation modes at 1182 and 1229 cm⁻¹, collectively reflecting the stability of the sulfonate substituents on all examined substrates [18,19,29]. In the fingerprint region II (1335–1480 cm⁻¹), vibrational modes of the naphthalene and phenyl rings coexist with C–N, N–H and N–N stretching contributions of the hydrazone tautomer, characteristic of the hydrazone linkage and the extended aromatic core of SSY [18,19]. The D band of graphene (∼1350 cm⁻¹) coincides with this N–N/C–N hydrazone stretching region in the graphene-coated spectra. In the high-frequency region (1501–1598 cm⁻¹), the bands at 1501 and 1549 cm⁻¹ arise from C=O and C–N stretching coupled with N–H in-plane bending and naphthalene skeletal vibrations, respectively, where the C=O stretching is a hallmark of the keto-hydrazone tautomeric form [18,19]. The most intense band at 1598 cm⁻¹ is assigned to symmetric C–C stretching of the naphthalene (R1) and phenyl (R2) rings, reflecting the extended π-conjugation of the SSY chromophore [18,19]. The graphene G band (∼1580 cm⁻¹) is superimposed on this region in the Gr-coated spectra and partially overlaps with the 1598 cm⁻¹ SSY band. By visual inspection, all four SSY spectra are virtually indistinguishable across the entire 500–1800 cm⁻¹ window despite the substrate-dependent interfacial environments. This high spectral similarity constitutes the fundamental analytical challenge and motivates the machine learning approach described in the following sections.</w:t>
       </w:r>
       <w:r>
         <w:rPr>
@@ -2253,7 +2253,7 @@
           <w:sz w:val="22"/>
           <w:szCs w:val="22"/>
         </w:rPr>
-        <w:t>Figure 1: Mean Raman spectra (± 1 SD, shaded grey region) of four SSY samples after baseline correction, plotted as a function of Raman shift (cm⁻¹) over the analytical window 450–1800 cm⁻¹. Note: the x-axis in the original figure should be labelled 'Raman shift (cm⁻¹)'.</w:t>
+        <w:t>Figure 1: Mean Raman spectra (± 1 SD, shaded grey region) of four SSY samples after baseline correction, plotted as a function of Raman shift (cm⁻¹) over the analytical window 500–1800 cm⁻¹. Note: the x-axis in the original figure should be labelled 'Raman shift (cm⁻¹)'.</w:t>
       </w:r>
       <w:r>
         <w:rPr>

</xml_diff>

<commit_message>
Add Table 1: complete SSY Raman band assignment table (500–1800 cm⁻¹)
18 data rows covering all spectral regions for the keto-hydrazone tautomer:
- 530–1598 cm⁻¹ SSY assignments with references [18,19,21,29]
- Graphene D (~1350) and G (~1580) bands highlighted separately (amber)
- Dark header row; alternating row shading; bold wavenumber column
- Table caption notes amber = graphene-only features

Co-Authored-By: Claude Sonnet 4.6 <noreply@anthropic.com>
Claude-Session: https://claude.ai/code/session_01MNVMUP3XQfcv4xQxHGe3PS
</commit_message>
<xml_diff>
--- a/MANUSCRIPT-SpectroActaPartA-FAGGIO_revised.docx
+++ b/MANUSCRIPT-SpectroActaPartA-FAGGIO_revised.docx
@@ -2170,6 +2170,1321 @@
           <w:rFonts w:eastAsia="MS Mincho"/>
           <w:lang w:val="en-US" w:eastAsia="en-US"/>
         </w:rPr>
+      </w:r>
+    </w:p>
+    <w:tbl>
+      <w:tblPr>
+        <w:tblW w:type="auto" w:w="0"/>
+        <w:tblLook w:firstColumn="1" w:firstRow="1" w:lastColumn="0" w:lastRow="0" w:noHBand="0" w:noVBand="1" w:val="04A0"/>
+      </w:tblPr>
+      <w:tblGrid>
+        <w:gridCol w:w="1656"/>
+        <w:gridCol w:w="6624"/>
+        <w:gridCol w:w="1296"/>
+      </w:tblGrid>
+      <w:tr>
+        <w:tc>
+          <w:tcPr>
+            <w:tcW w:type="dxa" w:w="3120"/>
+            <w:shd w:val="clear" w:color="auto" w:fill="404040"/>
+            <w:tcBorders>
+              <w:top w:val="single" w:sz="4" w:space="0" w:color="999999"/>
+              <w:left w:val="single" w:sz="4" w:space="0" w:color="999999"/>
+              <w:bottom w:val="single" w:sz="4" w:space="0" w:color="999999"/>
+              <w:right w:val="single" w:sz="4" w:space="0" w:color="999999"/>
+            </w:tcBorders>
+          </w:tcPr>
+          <w:p>
+            <w:r>
+              <w:rPr>
+                <w:b/>
+                <w:i w:val="0"/>
+                <w:color w:val="FFFFFF"/>
+                <w:sz w:val="18"/>
+              </w:rPr>
+              <w:t>Raman Shift (cm⁻¹)</w:t>
+            </w:r>
+          </w:p>
+        </w:tc>
+        <w:tc>
+          <w:tcPr>
+            <w:tcW w:type="dxa" w:w="3120"/>
+            <w:shd w:val="clear" w:color="auto" w:fill="404040"/>
+            <w:tcBorders>
+              <w:top w:val="single" w:sz="4" w:space="0" w:color="999999"/>
+              <w:left w:val="single" w:sz="4" w:space="0" w:color="999999"/>
+              <w:bottom w:val="single" w:sz="4" w:space="0" w:color="999999"/>
+              <w:right w:val="single" w:sz="4" w:space="0" w:color="999999"/>
+            </w:tcBorders>
+          </w:tcPr>
+          <w:p>
+            <w:r>
+              <w:rPr>
+                <w:b/>
+                <w:i w:val="0"/>
+                <w:color w:val="FFFFFF"/>
+                <w:sz w:val="18"/>
+              </w:rPr>
+              <w:t>Vibrational Assignment</w:t>
+            </w:r>
+          </w:p>
+        </w:tc>
+        <w:tc>
+          <w:tcPr>
+            <w:tcW w:type="dxa" w:w="3120"/>
+            <w:shd w:val="clear" w:color="auto" w:fill="404040"/>
+            <w:tcBorders>
+              <w:top w:val="single" w:sz="4" w:space="0" w:color="999999"/>
+              <w:left w:val="single" w:sz="4" w:space="0" w:color="999999"/>
+              <w:bottom w:val="single" w:sz="4" w:space="0" w:color="999999"/>
+              <w:right w:val="single" w:sz="4" w:space="0" w:color="999999"/>
+            </w:tcBorders>
+          </w:tcPr>
+          <w:p>
+            <w:r>
+              <w:rPr>
+                <w:b/>
+                <w:i w:val="0"/>
+                <w:color w:val="FFFFFF"/>
+                <w:sz w:val="18"/>
+              </w:rPr>
+              <w:t>Ref.</w:t>
+            </w:r>
+          </w:p>
+        </w:tc>
+      </w:tr>
+      <w:tr>
+        <w:tc>
+          <w:tcPr>
+            <w:tcW w:type="dxa" w:w="3120"/>
+            <w:shd w:val="clear" w:color="auto" w:fill="F0F4FF"/>
+            <w:tcBorders>
+              <w:top w:val="single" w:sz="4" w:space="0" w:color="999999"/>
+              <w:left w:val="single" w:sz="4" w:space="0" w:color="999999"/>
+              <w:bottom w:val="single" w:sz="4" w:space="0" w:color="999999"/>
+              <w:right w:val="single" w:sz="4" w:space="0" w:color="999999"/>
+            </w:tcBorders>
+          </w:tcPr>
+          <w:p>
+            <w:r>
+              <w:rPr>
+                <w:b/>
+                <w:i w:val="0"/>
+                <w:sz w:val="18"/>
+              </w:rPr>
+              <w:t>530–560</w:t>
+            </w:r>
+          </w:p>
+        </w:tc>
+        <w:tc>
+          <w:tcPr>
+            <w:tcW w:type="dxa" w:w="3120"/>
+            <w:shd w:val="clear" w:color="auto" w:fill="F0F4FF"/>
+            <w:tcBorders>
+              <w:top w:val="single" w:sz="4" w:space="0" w:color="999999"/>
+              <w:left w:val="single" w:sz="4" w:space="0" w:color="999999"/>
+              <w:bottom w:val="single" w:sz="4" w:space="0" w:color="999999"/>
+              <w:right w:val="single" w:sz="4" w:space="0" w:color="999999"/>
+            </w:tcBorders>
+          </w:tcPr>
+          <w:p>
+            <w:r>
+              <w:rPr>
+                <w:b w:val="0"/>
+                <w:i w:val="0"/>
+                <w:sz w:val="18"/>
+              </w:rPr>
+              <w:t>SO₃⁻ symmetric deformation (δₛ SO₃⁻); out-of-plane ring torsion of naphthalene (R1)</w:t>
+            </w:r>
+          </w:p>
+        </w:tc>
+        <w:tc>
+          <w:tcPr>
+            <w:tcW w:type="dxa" w:w="3120"/>
+            <w:shd w:val="clear" w:color="auto" w:fill="F0F4FF"/>
+            <w:tcBorders>
+              <w:top w:val="single" w:sz="4" w:space="0" w:color="999999"/>
+              <w:left w:val="single" w:sz="4" w:space="0" w:color="999999"/>
+              <w:bottom w:val="single" w:sz="4" w:space="0" w:color="999999"/>
+              <w:right w:val="single" w:sz="4" w:space="0" w:color="999999"/>
+            </w:tcBorders>
+          </w:tcPr>
+          <w:p>
+            <w:r>
+              <w:rPr>
+                <w:b w:val="0"/>
+                <w:i w:val="0"/>
+                <w:sz w:val="18"/>
+              </w:rPr>
+              <w:t>[18,19]</w:t>
+            </w:r>
+          </w:p>
+        </w:tc>
+      </w:tr>
+      <w:tr>
+        <w:tc>
+          <w:tcPr>
+            <w:tcW w:type="dxa" w:w="3120"/>
+            <w:shd w:val="clear" w:color="auto" w:fill="FFFFFF"/>
+            <w:tcBorders>
+              <w:top w:val="single" w:sz="4" w:space="0" w:color="999999"/>
+              <w:left w:val="single" w:sz="4" w:space="0" w:color="999999"/>
+              <w:bottom w:val="single" w:sz="4" w:space="0" w:color="999999"/>
+              <w:right w:val="single" w:sz="4" w:space="0" w:color="999999"/>
+            </w:tcBorders>
+          </w:tcPr>
+          <w:p>
+            <w:r>
+              <w:rPr>
+                <w:b/>
+                <w:i w:val="0"/>
+                <w:sz w:val="18"/>
+              </w:rPr>
+              <w:t>580–630</w:t>
+            </w:r>
+          </w:p>
+        </w:tc>
+        <w:tc>
+          <w:tcPr>
+            <w:tcW w:type="dxa" w:w="3120"/>
+            <w:shd w:val="clear" w:color="auto" w:fill="FFFFFF"/>
+            <w:tcBorders>
+              <w:top w:val="single" w:sz="4" w:space="0" w:color="999999"/>
+              <w:left w:val="single" w:sz="4" w:space="0" w:color="999999"/>
+              <w:bottom w:val="single" w:sz="4" w:space="0" w:color="999999"/>
+              <w:right w:val="single" w:sz="4" w:space="0" w:color="999999"/>
+            </w:tcBorders>
+          </w:tcPr>
+          <w:p>
+            <w:r>
+              <w:rPr>
+                <w:b w:val="0"/>
+                <w:i w:val="0"/>
+                <w:sz w:val="18"/>
+              </w:rPr>
+              <w:t>C–S stretching coupled with ring skeletal bending</w:t>
+            </w:r>
+          </w:p>
+        </w:tc>
+        <w:tc>
+          <w:tcPr>
+            <w:tcW w:type="dxa" w:w="3120"/>
+            <w:shd w:val="clear" w:color="auto" w:fill="FFFFFF"/>
+            <w:tcBorders>
+              <w:top w:val="single" w:sz="4" w:space="0" w:color="999999"/>
+              <w:left w:val="single" w:sz="4" w:space="0" w:color="999999"/>
+              <w:bottom w:val="single" w:sz="4" w:space="0" w:color="999999"/>
+              <w:right w:val="single" w:sz="4" w:space="0" w:color="999999"/>
+            </w:tcBorders>
+          </w:tcPr>
+          <w:p>
+            <w:r>
+              <w:rPr>
+                <w:b w:val="0"/>
+                <w:i w:val="0"/>
+                <w:sz w:val="18"/>
+              </w:rPr>
+              <w:t>[19,21]</w:t>
+            </w:r>
+          </w:p>
+        </w:tc>
+      </w:tr>
+      <w:tr>
+        <w:tc>
+          <w:tcPr>
+            <w:tcW w:type="dxa" w:w="3120"/>
+            <w:shd w:val="clear" w:color="auto" w:fill="F0F4FF"/>
+            <w:tcBorders>
+              <w:top w:val="single" w:sz="4" w:space="0" w:color="999999"/>
+              <w:left w:val="single" w:sz="4" w:space="0" w:color="999999"/>
+              <w:bottom w:val="single" w:sz="4" w:space="0" w:color="999999"/>
+              <w:right w:val="single" w:sz="4" w:space="0" w:color="999999"/>
+            </w:tcBorders>
+          </w:tcPr>
+          <w:p>
+            <w:r>
+              <w:rPr>
+                <w:b/>
+                <w:i w:val="0"/>
+                <w:sz w:val="18"/>
+              </w:rPr>
+              <w:t>640–680</w:t>
+            </w:r>
+          </w:p>
+        </w:tc>
+        <w:tc>
+          <w:tcPr>
+            <w:tcW w:type="dxa" w:w="3120"/>
+            <w:shd w:val="clear" w:color="auto" w:fill="F0F4FF"/>
+            <w:tcBorders>
+              <w:top w:val="single" w:sz="4" w:space="0" w:color="999999"/>
+              <w:left w:val="single" w:sz="4" w:space="0" w:color="999999"/>
+              <w:bottom w:val="single" w:sz="4" w:space="0" w:color="999999"/>
+              <w:right w:val="single" w:sz="4" w:space="0" w:color="999999"/>
+            </w:tcBorders>
+          </w:tcPr>
+          <w:p>
+            <w:r>
+              <w:rPr>
+                <w:b w:val="0"/>
+                <w:i w:val="0"/>
+                <w:sz w:val="18"/>
+              </w:rPr>
+              <w:t>C–H out-of-plane bending (γ C–H) of naphthalene (R1) and phenyl (R2) rings</w:t>
+            </w:r>
+          </w:p>
+        </w:tc>
+        <w:tc>
+          <w:tcPr>
+            <w:tcW w:type="dxa" w:w="3120"/>
+            <w:shd w:val="clear" w:color="auto" w:fill="F0F4FF"/>
+            <w:tcBorders>
+              <w:top w:val="single" w:sz="4" w:space="0" w:color="999999"/>
+              <w:left w:val="single" w:sz="4" w:space="0" w:color="999999"/>
+              <w:bottom w:val="single" w:sz="4" w:space="0" w:color="999999"/>
+              <w:right w:val="single" w:sz="4" w:space="0" w:color="999999"/>
+            </w:tcBorders>
+          </w:tcPr>
+          <w:p>
+            <w:r>
+              <w:rPr>
+                <w:b w:val="0"/>
+                <w:i w:val="0"/>
+                <w:sz w:val="18"/>
+              </w:rPr>
+              <w:t>[19,21]</w:t>
+            </w:r>
+          </w:p>
+        </w:tc>
+      </w:tr>
+      <w:tr>
+        <w:tc>
+          <w:tcPr>
+            <w:tcW w:type="dxa" w:w="3120"/>
+            <w:shd w:val="clear" w:color="auto" w:fill="FFFFFF"/>
+            <w:tcBorders>
+              <w:top w:val="single" w:sz="4" w:space="0" w:color="999999"/>
+              <w:left w:val="single" w:sz="4" w:space="0" w:color="999999"/>
+              <w:bottom w:val="single" w:sz="4" w:space="0" w:color="999999"/>
+              <w:right w:val="single" w:sz="4" w:space="0" w:color="999999"/>
+            </w:tcBorders>
+          </w:tcPr>
+          <w:p>
+            <w:r>
+              <w:rPr>
+                <w:b/>
+                <w:i w:val="0"/>
+                <w:sz w:val="18"/>
+              </w:rPr>
+              <w:t>700–730</w:t>
+            </w:r>
+          </w:p>
+        </w:tc>
+        <w:tc>
+          <w:tcPr>
+            <w:tcW w:type="dxa" w:w="3120"/>
+            <w:shd w:val="clear" w:color="auto" w:fill="FFFFFF"/>
+            <w:tcBorders>
+              <w:top w:val="single" w:sz="4" w:space="0" w:color="999999"/>
+              <w:left w:val="single" w:sz="4" w:space="0" w:color="999999"/>
+              <w:bottom w:val="single" w:sz="4" w:space="0" w:color="999999"/>
+              <w:right w:val="single" w:sz="4" w:space="0" w:color="999999"/>
+            </w:tcBorders>
+          </w:tcPr>
+          <w:p>
+            <w:r>
+              <w:rPr>
+                <w:b w:val="0"/>
+                <w:i w:val="0"/>
+                <w:sz w:val="18"/>
+              </w:rPr>
+              <w:t>C–H out-of-plane wagging of naphthalene; ring skeletal deformation</w:t>
+            </w:r>
+          </w:p>
+        </w:tc>
+        <w:tc>
+          <w:tcPr>
+            <w:tcW w:type="dxa" w:w="3120"/>
+            <w:shd w:val="clear" w:color="auto" w:fill="FFFFFF"/>
+            <w:tcBorders>
+              <w:top w:val="single" w:sz="4" w:space="0" w:color="999999"/>
+              <w:left w:val="single" w:sz="4" w:space="0" w:color="999999"/>
+              <w:bottom w:val="single" w:sz="4" w:space="0" w:color="999999"/>
+              <w:right w:val="single" w:sz="4" w:space="0" w:color="999999"/>
+            </w:tcBorders>
+          </w:tcPr>
+          <w:p>
+            <w:r>
+              <w:rPr>
+                <w:b w:val="0"/>
+                <w:i w:val="0"/>
+                <w:sz w:val="18"/>
+              </w:rPr>
+              <w:t>[19,21]</w:t>
+            </w:r>
+          </w:p>
+        </w:tc>
+      </w:tr>
+      <w:tr>
+        <w:tc>
+          <w:tcPr>
+            <w:tcW w:type="dxa" w:w="3120"/>
+            <w:shd w:val="clear" w:color="auto" w:fill="F0F4FF"/>
+            <w:tcBorders>
+              <w:top w:val="single" w:sz="4" w:space="0" w:color="999999"/>
+              <w:left w:val="single" w:sz="4" w:space="0" w:color="999999"/>
+              <w:bottom w:val="single" w:sz="4" w:space="0" w:color="999999"/>
+              <w:right w:val="single" w:sz="4" w:space="0" w:color="999999"/>
+            </w:tcBorders>
+          </w:tcPr>
+          <w:p>
+            <w:r>
+              <w:rPr>
+                <w:b/>
+                <w:i w:val="0"/>
+                <w:sz w:val="18"/>
+              </w:rPr>
+              <w:t>770–800</w:t>
+            </w:r>
+          </w:p>
+        </w:tc>
+        <w:tc>
+          <w:tcPr>
+            <w:tcW w:type="dxa" w:w="3120"/>
+            <w:shd w:val="clear" w:color="auto" w:fill="F0F4FF"/>
+            <w:tcBorders>
+              <w:top w:val="single" w:sz="4" w:space="0" w:color="999999"/>
+              <w:left w:val="single" w:sz="4" w:space="0" w:color="999999"/>
+              <w:bottom w:val="single" w:sz="4" w:space="0" w:color="999999"/>
+              <w:right w:val="single" w:sz="4" w:space="0" w:color="999999"/>
+            </w:tcBorders>
+          </w:tcPr>
+          <w:p>
+            <w:r>
+              <w:rPr>
+                <w:b w:val="0"/>
+                <w:i w:val="0"/>
+                <w:sz w:val="18"/>
+              </w:rPr>
+              <w:t>Naphthalene ring breathing; C–H out-of-plane bending (peri-substituted positions)</w:t>
+            </w:r>
+          </w:p>
+        </w:tc>
+        <w:tc>
+          <w:tcPr>
+            <w:tcW w:type="dxa" w:w="3120"/>
+            <w:shd w:val="clear" w:color="auto" w:fill="F0F4FF"/>
+            <w:tcBorders>
+              <w:top w:val="single" w:sz="4" w:space="0" w:color="999999"/>
+              <w:left w:val="single" w:sz="4" w:space="0" w:color="999999"/>
+              <w:bottom w:val="single" w:sz="4" w:space="0" w:color="999999"/>
+              <w:right w:val="single" w:sz="4" w:space="0" w:color="999999"/>
+            </w:tcBorders>
+          </w:tcPr>
+          <w:p>
+            <w:r>
+              <w:rPr>
+                <w:b w:val="0"/>
+                <w:i w:val="0"/>
+                <w:sz w:val="18"/>
+              </w:rPr>
+              <w:t>[18,19]</w:t>
+            </w:r>
+          </w:p>
+        </w:tc>
+      </w:tr>
+      <w:tr>
+        <w:tc>
+          <w:tcPr>
+            <w:tcW w:type="dxa" w:w="3120"/>
+            <w:shd w:val="clear" w:color="auto" w:fill="FFFFFF"/>
+            <w:tcBorders>
+              <w:top w:val="single" w:sz="4" w:space="0" w:color="999999"/>
+              <w:left w:val="single" w:sz="4" w:space="0" w:color="999999"/>
+              <w:bottom w:val="single" w:sz="4" w:space="0" w:color="999999"/>
+              <w:right w:val="single" w:sz="4" w:space="0" w:color="999999"/>
+            </w:tcBorders>
+          </w:tcPr>
+          <w:p>
+            <w:r>
+              <w:rPr>
+                <w:b/>
+                <w:i w:val="0"/>
+                <w:sz w:val="18"/>
+              </w:rPr>
+              <w:t>830–870</w:t>
+            </w:r>
+          </w:p>
+        </w:tc>
+        <w:tc>
+          <w:tcPr>
+            <w:tcW w:type="dxa" w:w="3120"/>
+            <w:shd w:val="clear" w:color="auto" w:fill="FFFFFF"/>
+            <w:tcBorders>
+              <w:top w:val="single" w:sz="4" w:space="0" w:color="999999"/>
+              <w:left w:val="single" w:sz="4" w:space="0" w:color="999999"/>
+              <w:bottom w:val="single" w:sz="4" w:space="0" w:color="999999"/>
+              <w:right w:val="single" w:sz="4" w:space="0" w:color="999999"/>
+            </w:tcBorders>
+          </w:tcPr>
+          <w:p>
+            <w:r>
+              <w:rPr>
+                <w:b w:val="0"/>
+                <w:i w:val="0"/>
+                <w:sz w:val="18"/>
+              </w:rPr>
+              <w:t>Ring deformation; C–H out-of-plane bending of para-substituted phenyl (R2)</w:t>
+            </w:r>
+          </w:p>
+        </w:tc>
+        <w:tc>
+          <w:tcPr>
+            <w:tcW w:type="dxa" w:w="3120"/>
+            <w:shd w:val="clear" w:color="auto" w:fill="FFFFFF"/>
+            <w:tcBorders>
+              <w:top w:val="single" w:sz="4" w:space="0" w:color="999999"/>
+              <w:left w:val="single" w:sz="4" w:space="0" w:color="999999"/>
+              <w:bottom w:val="single" w:sz="4" w:space="0" w:color="999999"/>
+              <w:right w:val="single" w:sz="4" w:space="0" w:color="999999"/>
+            </w:tcBorders>
+          </w:tcPr>
+          <w:p>
+            <w:r>
+              <w:rPr>
+                <w:b w:val="0"/>
+                <w:i w:val="0"/>
+                <w:sz w:val="18"/>
+              </w:rPr>
+              <w:t>[19,21]</w:t>
+            </w:r>
+          </w:p>
+        </w:tc>
+      </w:tr>
+      <w:tr>
+        <w:tc>
+          <w:tcPr>
+            <w:tcW w:type="dxa" w:w="3120"/>
+            <w:shd w:val="clear" w:color="auto" w:fill="F0F4FF"/>
+            <w:tcBorders>
+              <w:top w:val="single" w:sz="4" w:space="0" w:color="999999"/>
+              <w:left w:val="single" w:sz="4" w:space="0" w:color="999999"/>
+              <w:bottom w:val="single" w:sz="4" w:space="0" w:color="999999"/>
+              <w:right w:val="single" w:sz="4" w:space="0" w:color="999999"/>
+            </w:tcBorders>
+          </w:tcPr>
+          <w:p>
+            <w:r>
+              <w:rPr>
+                <w:b/>
+                <w:i w:val="0"/>
+                <w:sz w:val="18"/>
+              </w:rPr>
+              <w:t>960–990</w:t>
+            </w:r>
+          </w:p>
+        </w:tc>
+        <w:tc>
+          <w:tcPr>
+            <w:tcW w:type="dxa" w:w="3120"/>
+            <w:shd w:val="clear" w:color="auto" w:fill="F0F4FF"/>
+            <w:tcBorders>
+              <w:top w:val="single" w:sz="4" w:space="0" w:color="999999"/>
+              <w:left w:val="single" w:sz="4" w:space="0" w:color="999999"/>
+              <w:bottom w:val="single" w:sz="4" w:space="0" w:color="999999"/>
+              <w:right w:val="single" w:sz="4" w:space="0" w:color="999999"/>
+            </w:tcBorders>
+          </w:tcPr>
+          <w:p>
+            <w:r>
+              <w:rPr>
+                <w:b w:val="0"/>
+                <w:i w:val="0"/>
+                <w:sz w:val="18"/>
+              </w:rPr>
+              <w:t>ν(N–N) hydrazone linkage — diagnostic band of the keto-hydrazone tautomer</w:t>
+            </w:r>
+          </w:p>
+        </w:tc>
+        <w:tc>
+          <w:tcPr>
+            <w:tcW w:type="dxa" w:w="3120"/>
+            <w:shd w:val="clear" w:color="auto" w:fill="F0F4FF"/>
+            <w:tcBorders>
+              <w:top w:val="single" w:sz="4" w:space="0" w:color="999999"/>
+              <w:left w:val="single" w:sz="4" w:space="0" w:color="999999"/>
+              <w:bottom w:val="single" w:sz="4" w:space="0" w:color="999999"/>
+              <w:right w:val="single" w:sz="4" w:space="0" w:color="999999"/>
+            </w:tcBorders>
+          </w:tcPr>
+          <w:p>
+            <w:r>
+              <w:rPr>
+                <w:b w:val="0"/>
+                <w:i w:val="0"/>
+                <w:sz w:val="18"/>
+              </w:rPr>
+              <w:t>[19]</w:t>
+            </w:r>
+          </w:p>
+        </w:tc>
+      </w:tr>
+      <w:tr>
+        <w:tc>
+          <w:tcPr>
+            <w:tcW w:type="dxa" w:w="3120"/>
+            <w:shd w:val="clear" w:color="auto" w:fill="FFFFFF"/>
+            <w:tcBorders>
+              <w:top w:val="single" w:sz="4" w:space="0" w:color="999999"/>
+              <w:left w:val="single" w:sz="4" w:space="0" w:color="999999"/>
+              <w:bottom w:val="single" w:sz="4" w:space="0" w:color="999999"/>
+              <w:right w:val="single" w:sz="4" w:space="0" w:color="999999"/>
+            </w:tcBorders>
+          </w:tcPr>
+          <w:p>
+            <w:r>
+              <w:rPr>
+                <w:b/>
+                <w:i w:val="0"/>
+                <w:sz w:val="18"/>
+              </w:rPr>
+              <w:t>1000–1090</w:t>
+            </w:r>
+          </w:p>
+        </w:tc>
+        <w:tc>
+          <w:tcPr>
+            <w:tcW w:type="dxa" w:w="3120"/>
+            <w:shd w:val="clear" w:color="auto" w:fill="FFFFFF"/>
+            <w:tcBorders>
+              <w:top w:val="single" w:sz="4" w:space="0" w:color="999999"/>
+              <w:left w:val="single" w:sz="4" w:space="0" w:color="999999"/>
+              <w:bottom w:val="single" w:sz="4" w:space="0" w:color="999999"/>
+              <w:right w:val="single" w:sz="4" w:space="0" w:color="999999"/>
+            </w:tcBorders>
+          </w:tcPr>
+          <w:p>
+            <w:r>
+              <w:rPr>
+                <w:b w:val="0"/>
+                <w:i w:val="0"/>
+                <w:sz w:val="18"/>
+              </w:rPr>
+              <w:t>Ring trigonal bending; C–H in-plane bending; skeletal ring vibrations</w:t>
+            </w:r>
+          </w:p>
+        </w:tc>
+        <w:tc>
+          <w:tcPr>
+            <w:tcW w:type="dxa" w:w="3120"/>
+            <w:shd w:val="clear" w:color="auto" w:fill="FFFFFF"/>
+            <w:tcBorders>
+              <w:top w:val="single" w:sz="4" w:space="0" w:color="999999"/>
+              <w:left w:val="single" w:sz="4" w:space="0" w:color="999999"/>
+              <w:bottom w:val="single" w:sz="4" w:space="0" w:color="999999"/>
+              <w:right w:val="single" w:sz="4" w:space="0" w:color="999999"/>
+            </w:tcBorders>
+          </w:tcPr>
+          <w:p>
+            <w:r>
+              <w:rPr>
+                <w:b w:val="0"/>
+                <w:i w:val="0"/>
+                <w:sz w:val="18"/>
+              </w:rPr>
+              <w:t>[18,19,29]</w:t>
+            </w:r>
+          </w:p>
+        </w:tc>
+      </w:tr>
+      <w:tr>
+        <w:tc>
+          <w:tcPr>
+            <w:tcW w:type="dxa" w:w="3120"/>
+            <w:shd w:val="clear" w:color="auto" w:fill="F0F4FF"/>
+            <w:tcBorders>
+              <w:top w:val="single" w:sz="4" w:space="0" w:color="999999"/>
+              <w:left w:val="single" w:sz="4" w:space="0" w:color="999999"/>
+              <w:bottom w:val="single" w:sz="4" w:space="0" w:color="999999"/>
+              <w:right w:val="single" w:sz="4" w:space="0" w:color="999999"/>
+            </w:tcBorders>
+          </w:tcPr>
+          <w:p>
+            <w:r>
+              <w:rPr>
+                <w:b/>
+                <w:i w:val="0"/>
+                <w:sz w:val="18"/>
+              </w:rPr>
+              <w:t>1094</w:t>
+            </w:r>
+          </w:p>
+        </w:tc>
+        <w:tc>
+          <w:tcPr>
+            <w:tcW w:type="dxa" w:w="3120"/>
+            <w:shd w:val="clear" w:color="auto" w:fill="F0F4FF"/>
+            <w:tcBorders>
+              <w:top w:val="single" w:sz="4" w:space="0" w:color="999999"/>
+              <w:left w:val="single" w:sz="4" w:space="0" w:color="999999"/>
+              <w:bottom w:val="single" w:sz="4" w:space="0" w:color="999999"/>
+              <w:right w:val="single" w:sz="4" w:space="0" w:color="999999"/>
+            </w:tcBorders>
+          </w:tcPr>
+          <w:p>
+            <w:r>
+              <w:rPr>
+                <w:b w:val="0"/>
+                <w:i w:val="0"/>
+                <w:sz w:val="18"/>
+              </w:rPr>
+              <w:t>Ring bending/deformation modes of naphthalene (R1)</w:t>
+            </w:r>
+          </w:p>
+        </w:tc>
+        <w:tc>
+          <w:tcPr>
+            <w:tcW w:type="dxa" w:w="3120"/>
+            <w:shd w:val="clear" w:color="auto" w:fill="F0F4FF"/>
+            <w:tcBorders>
+              <w:top w:val="single" w:sz="4" w:space="0" w:color="999999"/>
+              <w:left w:val="single" w:sz="4" w:space="0" w:color="999999"/>
+              <w:bottom w:val="single" w:sz="4" w:space="0" w:color="999999"/>
+              <w:right w:val="single" w:sz="4" w:space="0" w:color="999999"/>
+            </w:tcBorders>
+          </w:tcPr>
+          <w:p>
+            <w:r>
+              <w:rPr>
+                <w:b w:val="0"/>
+                <w:i w:val="0"/>
+                <w:sz w:val="18"/>
+              </w:rPr>
+              <w:t>[18,19]</w:t>
+            </w:r>
+          </w:p>
+        </w:tc>
+      </w:tr>
+      <w:tr>
+        <w:tc>
+          <w:tcPr>
+            <w:tcW w:type="dxa" w:w="3120"/>
+            <w:shd w:val="clear" w:color="auto" w:fill="FFFFFF"/>
+            <w:tcBorders>
+              <w:top w:val="single" w:sz="4" w:space="0" w:color="999999"/>
+              <w:left w:val="single" w:sz="4" w:space="0" w:color="999999"/>
+              <w:bottom w:val="single" w:sz="4" w:space="0" w:color="999999"/>
+              <w:right w:val="single" w:sz="4" w:space="0" w:color="999999"/>
+            </w:tcBorders>
+          </w:tcPr>
+          <w:p>
+            <w:r>
+              <w:rPr>
+                <w:b/>
+                <w:i w:val="0"/>
+                <w:sz w:val="18"/>
+              </w:rPr>
+              <w:t>1127</w:t>
+            </w:r>
+          </w:p>
+        </w:tc>
+        <w:tc>
+          <w:tcPr>
+            <w:tcW w:type="dxa" w:w="3120"/>
+            <w:shd w:val="clear" w:color="auto" w:fill="FFFFFF"/>
+            <w:tcBorders>
+              <w:top w:val="single" w:sz="4" w:space="0" w:color="999999"/>
+              <w:left w:val="single" w:sz="4" w:space="0" w:color="999999"/>
+              <w:bottom w:val="single" w:sz="4" w:space="0" w:color="999999"/>
+              <w:right w:val="single" w:sz="4" w:space="0" w:color="999999"/>
+            </w:tcBorders>
+          </w:tcPr>
+          <w:p>
+            <w:r>
+              <w:rPr>
+                <w:b w:val="0"/>
+                <w:i w:val="0"/>
+                <w:sz w:val="18"/>
+              </w:rPr>
+              <w:t>Ring deformation of phenyl (R2)</w:t>
+            </w:r>
+          </w:p>
+        </w:tc>
+        <w:tc>
+          <w:tcPr>
+            <w:tcW w:type="dxa" w:w="3120"/>
+            <w:shd w:val="clear" w:color="auto" w:fill="FFFFFF"/>
+            <w:tcBorders>
+              <w:top w:val="single" w:sz="4" w:space="0" w:color="999999"/>
+              <w:left w:val="single" w:sz="4" w:space="0" w:color="999999"/>
+              <w:bottom w:val="single" w:sz="4" w:space="0" w:color="999999"/>
+              <w:right w:val="single" w:sz="4" w:space="0" w:color="999999"/>
+            </w:tcBorders>
+          </w:tcPr>
+          <w:p>
+            <w:r>
+              <w:rPr>
+                <w:b w:val="0"/>
+                <w:i w:val="0"/>
+                <w:sz w:val="18"/>
+              </w:rPr>
+              <w:t>[18,19]</w:t>
+            </w:r>
+          </w:p>
+        </w:tc>
+      </w:tr>
+      <w:tr>
+        <w:tc>
+          <w:tcPr>
+            <w:tcW w:type="dxa" w:w="3120"/>
+            <w:shd w:val="clear" w:color="auto" w:fill="F0F4FF"/>
+            <w:tcBorders>
+              <w:top w:val="single" w:sz="4" w:space="0" w:color="999999"/>
+              <w:left w:val="single" w:sz="4" w:space="0" w:color="999999"/>
+              <w:bottom w:val="single" w:sz="4" w:space="0" w:color="999999"/>
+              <w:right w:val="single" w:sz="4" w:space="0" w:color="999999"/>
+            </w:tcBorders>
+          </w:tcPr>
+          <w:p>
+            <w:r>
+              <w:rPr>
+                <w:b/>
+                <w:i w:val="0"/>
+                <w:sz w:val="18"/>
+              </w:rPr>
+              <w:t>1182</w:t>
+            </w:r>
+          </w:p>
+        </w:tc>
+        <w:tc>
+          <w:tcPr>
+            <w:tcW w:type="dxa" w:w="3120"/>
+            <w:shd w:val="clear" w:color="auto" w:fill="F0F4FF"/>
+            <w:tcBorders>
+              <w:top w:val="single" w:sz="4" w:space="0" w:color="999999"/>
+              <w:left w:val="single" w:sz="4" w:space="0" w:color="999999"/>
+              <w:bottom w:val="single" w:sz="4" w:space="0" w:color="999999"/>
+              <w:right w:val="single" w:sz="4" w:space="0" w:color="999999"/>
+            </w:tcBorders>
+          </w:tcPr>
+          <w:p>
+            <w:r>
+              <w:rPr>
+                <w:b w:val="0"/>
+                <w:i w:val="0"/>
+                <w:sz w:val="18"/>
+              </w:rPr>
+              <w:t>SO₃ group activity; C–N stretching coupled with N–H deformation</w:t>
+            </w:r>
+          </w:p>
+        </w:tc>
+        <w:tc>
+          <w:tcPr>
+            <w:tcW w:type="dxa" w:w="3120"/>
+            <w:shd w:val="clear" w:color="auto" w:fill="F0F4FF"/>
+            <w:tcBorders>
+              <w:top w:val="single" w:sz="4" w:space="0" w:color="999999"/>
+              <w:left w:val="single" w:sz="4" w:space="0" w:color="999999"/>
+              <w:bottom w:val="single" w:sz="4" w:space="0" w:color="999999"/>
+              <w:right w:val="single" w:sz="4" w:space="0" w:color="999999"/>
+            </w:tcBorders>
+          </w:tcPr>
+          <w:p>
+            <w:r>
+              <w:rPr>
+                <w:b w:val="0"/>
+                <w:i w:val="0"/>
+                <w:sz w:val="18"/>
+              </w:rPr>
+              <w:t>[18,19,29]</w:t>
+            </w:r>
+          </w:p>
+        </w:tc>
+      </w:tr>
+      <w:tr>
+        <w:tc>
+          <w:tcPr>
+            <w:tcW w:type="dxa" w:w="3120"/>
+            <w:shd w:val="clear" w:color="auto" w:fill="FFFFFF"/>
+            <w:tcBorders>
+              <w:top w:val="single" w:sz="4" w:space="0" w:color="999999"/>
+              <w:left w:val="single" w:sz="4" w:space="0" w:color="999999"/>
+              <w:bottom w:val="single" w:sz="4" w:space="0" w:color="999999"/>
+              <w:right w:val="single" w:sz="4" w:space="0" w:color="999999"/>
+            </w:tcBorders>
+          </w:tcPr>
+          <w:p>
+            <w:r>
+              <w:rPr>
+                <w:b/>
+                <w:i w:val="0"/>
+                <w:sz w:val="18"/>
+              </w:rPr>
+              <w:t>1229</w:t>
+            </w:r>
+          </w:p>
+        </w:tc>
+        <w:tc>
+          <w:tcPr>
+            <w:tcW w:type="dxa" w:w="3120"/>
+            <w:shd w:val="clear" w:color="auto" w:fill="FFFFFF"/>
+            <w:tcBorders>
+              <w:top w:val="single" w:sz="4" w:space="0" w:color="999999"/>
+              <w:left w:val="single" w:sz="4" w:space="0" w:color="999999"/>
+              <w:bottom w:val="single" w:sz="4" w:space="0" w:color="999999"/>
+              <w:right w:val="single" w:sz="4" w:space="0" w:color="999999"/>
+            </w:tcBorders>
+          </w:tcPr>
+          <w:p>
+            <w:r>
+              <w:rPr>
+                <w:b w:val="0"/>
+                <w:i w:val="0"/>
+                <w:sz w:val="18"/>
+              </w:rPr>
+              <w:t>C–N stretching coupled with N–H and naphthalene deformation modes</w:t>
+            </w:r>
+          </w:p>
+        </w:tc>
+        <w:tc>
+          <w:tcPr>
+            <w:tcW w:type="dxa" w:w="3120"/>
+            <w:shd w:val="clear" w:color="auto" w:fill="FFFFFF"/>
+            <w:tcBorders>
+              <w:top w:val="single" w:sz="4" w:space="0" w:color="999999"/>
+              <w:left w:val="single" w:sz="4" w:space="0" w:color="999999"/>
+              <w:bottom w:val="single" w:sz="4" w:space="0" w:color="999999"/>
+              <w:right w:val="single" w:sz="4" w:space="0" w:color="999999"/>
+            </w:tcBorders>
+          </w:tcPr>
+          <w:p>
+            <w:r>
+              <w:rPr>
+                <w:b w:val="0"/>
+                <w:i w:val="0"/>
+                <w:sz w:val="18"/>
+              </w:rPr>
+              <w:t>[18,19]</w:t>
+            </w:r>
+          </w:p>
+        </w:tc>
+      </w:tr>
+      <w:tr>
+        <w:tc>
+          <w:tcPr>
+            <w:tcW w:type="dxa" w:w="3120"/>
+            <w:shd w:val="clear" w:color="auto" w:fill="F0F4FF"/>
+            <w:tcBorders>
+              <w:top w:val="single" w:sz="4" w:space="0" w:color="999999"/>
+              <w:left w:val="single" w:sz="4" w:space="0" w:color="999999"/>
+              <w:bottom w:val="single" w:sz="4" w:space="0" w:color="999999"/>
+              <w:right w:val="single" w:sz="4" w:space="0" w:color="999999"/>
+            </w:tcBorders>
+          </w:tcPr>
+          <w:p>
+            <w:r>
+              <w:rPr>
+                <w:b/>
+                <w:i w:val="0"/>
+                <w:sz w:val="18"/>
+              </w:rPr>
+              <w:t>1335–1480</w:t>
+            </w:r>
+          </w:p>
+        </w:tc>
+        <w:tc>
+          <w:tcPr>
+            <w:tcW w:type="dxa" w:w="3120"/>
+            <w:shd w:val="clear" w:color="auto" w:fill="F0F4FF"/>
+            <w:tcBorders>
+              <w:top w:val="single" w:sz="4" w:space="0" w:color="999999"/>
+              <w:left w:val="single" w:sz="4" w:space="0" w:color="999999"/>
+              <w:bottom w:val="single" w:sz="4" w:space="0" w:color="999999"/>
+              <w:right w:val="single" w:sz="4" w:space="0" w:color="999999"/>
+            </w:tcBorders>
+          </w:tcPr>
+          <w:p>
+            <w:r>
+              <w:rPr>
+                <w:b w:val="0"/>
+                <w:i w:val="0"/>
+                <w:sz w:val="18"/>
+              </w:rPr>
+              <w:t>C–N, N–H and N–N stretching (hydrazone tautomer); naphthalene and phenyl ring modes</w:t>
+            </w:r>
+          </w:p>
+        </w:tc>
+        <w:tc>
+          <w:tcPr>
+            <w:tcW w:type="dxa" w:w="3120"/>
+            <w:shd w:val="clear" w:color="auto" w:fill="F0F4FF"/>
+            <w:tcBorders>
+              <w:top w:val="single" w:sz="4" w:space="0" w:color="999999"/>
+              <w:left w:val="single" w:sz="4" w:space="0" w:color="999999"/>
+              <w:bottom w:val="single" w:sz="4" w:space="0" w:color="999999"/>
+              <w:right w:val="single" w:sz="4" w:space="0" w:color="999999"/>
+            </w:tcBorders>
+          </w:tcPr>
+          <w:p>
+            <w:r>
+              <w:rPr>
+                <w:b w:val="0"/>
+                <w:i w:val="0"/>
+                <w:sz w:val="18"/>
+              </w:rPr>
+              <w:t>[18,19]</w:t>
+            </w:r>
+          </w:p>
+        </w:tc>
+      </w:tr>
+      <w:tr>
+        <w:tc>
+          <w:tcPr>
+            <w:tcW w:type="dxa" w:w="3120"/>
+            <w:shd w:val="clear" w:color="auto" w:fill="FFF4E0"/>
+            <w:tcBorders>
+              <w:top w:val="single" w:sz="4" w:space="0" w:color="999999"/>
+              <w:left w:val="single" w:sz="4" w:space="0" w:color="999999"/>
+              <w:bottom w:val="single" w:sz="4" w:space="0" w:color="999999"/>
+              <w:right w:val="single" w:sz="4" w:space="0" w:color="999999"/>
+            </w:tcBorders>
+          </w:tcPr>
+          <w:p>
+            <w:r>
+              <w:rPr>
+                <w:b/>
+                <w:i/>
+                <w:sz w:val="18"/>
+              </w:rPr>
+              <w:t>∼1350 *</w:t>
+            </w:r>
+          </w:p>
+        </w:tc>
+        <w:tc>
+          <w:tcPr>
+            <w:tcW w:type="dxa" w:w="3120"/>
+            <w:shd w:val="clear" w:color="auto" w:fill="FFF4E0"/>
+            <w:tcBorders>
+              <w:top w:val="single" w:sz="4" w:space="0" w:color="999999"/>
+              <w:left w:val="single" w:sz="4" w:space="0" w:color="999999"/>
+              <w:bottom w:val="single" w:sz="4" w:space="0" w:color="999999"/>
+              <w:right w:val="single" w:sz="4" w:space="0" w:color="999999"/>
+            </w:tcBorders>
+          </w:tcPr>
+          <w:p>
+            <w:r>
+              <w:rPr>
+                <w:b w:val="0"/>
+                <w:i/>
+                <w:sz w:val="18"/>
+              </w:rPr>
+              <w:t>Graphene D band (defect-activated) — Gr-coated samples only</w:t>
+            </w:r>
+          </w:p>
+        </w:tc>
+        <w:tc>
+          <w:tcPr>
+            <w:tcW w:type="dxa" w:w="3120"/>
+            <w:shd w:val="clear" w:color="auto" w:fill="FFF4E0"/>
+            <w:tcBorders>
+              <w:top w:val="single" w:sz="4" w:space="0" w:color="999999"/>
+              <w:left w:val="single" w:sz="4" w:space="0" w:color="999999"/>
+              <w:bottom w:val="single" w:sz="4" w:space="0" w:color="999999"/>
+              <w:right w:val="single" w:sz="4" w:space="0" w:color="999999"/>
+            </w:tcBorders>
+          </w:tcPr>
+          <w:p>
+            <w:r>
+              <w:rPr>
+                <w:b w:val="0"/>
+                <w:i w:val="0"/>
+                <w:sz w:val="18"/>
+              </w:rPr>
+              <w:t>[30,31]</w:t>
+            </w:r>
+          </w:p>
+        </w:tc>
+      </w:tr>
+      <w:tr>
+        <w:tc>
+          <w:tcPr>
+            <w:tcW w:type="dxa" w:w="3120"/>
+            <w:shd w:val="clear" w:color="auto" w:fill="F0F4FF"/>
+            <w:tcBorders>
+              <w:top w:val="single" w:sz="4" w:space="0" w:color="999999"/>
+              <w:left w:val="single" w:sz="4" w:space="0" w:color="999999"/>
+              <w:bottom w:val="single" w:sz="4" w:space="0" w:color="999999"/>
+              <w:right w:val="single" w:sz="4" w:space="0" w:color="999999"/>
+            </w:tcBorders>
+          </w:tcPr>
+          <w:p>
+            <w:r>
+              <w:rPr>
+                <w:b/>
+                <w:i w:val="0"/>
+                <w:sz w:val="18"/>
+              </w:rPr>
+              <w:t>1501</w:t>
+            </w:r>
+          </w:p>
+        </w:tc>
+        <w:tc>
+          <w:tcPr>
+            <w:tcW w:type="dxa" w:w="3120"/>
+            <w:shd w:val="clear" w:color="auto" w:fill="F0F4FF"/>
+            <w:tcBorders>
+              <w:top w:val="single" w:sz="4" w:space="0" w:color="999999"/>
+              <w:left w:val="single" w:sz="4" w:space="0" w:color="999999"/>
+              <w:bottom w:val="single" w:sz="4" w:space="0" w:color="999999"/>
+              <w:right w:val="single" w:sz="4" w:space="0" w:color="999999"/>
+            </w:tcBorders>
+          </w:tcPr>
+          <w:p>
+            <w:r>
+              <w:rPr>
+                <w:b w:val="0"/>
+                <w:i w:val="0"/>
+                <w:sz w:val="18"/>
+              </w:rPr>
+              <w:t>C=O stretching coupled with C–N; N–H in-plane bending — keto-hydrazone marker</w:t>
+            </w:r>
+          </w:p>
+        </w:tc>
+        <w:tc>
+          <w:tcPr>
+            <w:tcW w:type="dxa" w:w="3120"/>
+            <w:shd w:val="clear" w:color="auto" w:fill="F0F4FF"/>
+            <w:tcBorders>
+              <w:top w:val="single" w:sz="4" w:space="0" w:color="999999"/>
+              <w:left w:val="single" w:sz="4" w:space="0" w:color="999999"/>
+              <w:bottom w:val="single" w:sz="4" w:space="0" w:color="999999"/>
+              <w:right w:val="single" w:sz="4" w:space="0" w:color="999999"/>
+            </w:tcBorders>
+          </w:tcPr>
+          <w:p>
+            <w:r>
+              <w:rPr>
+                <w:b w:val="0"/>
+                <w:i w:val="0"/>
+                <w:sz w:val="18"/>
+              </w:rPr>
+              <w:t>[18,19]</w:t>
+            </w:r>
+          </w:p>
+        </w:tc>
+      </w:tr>
+      <w:tr>
+        <w:tc>
+          <w:tcPr>
+            <w:tcW w:type="dxa" w:w="3120"/>
+            <w:shd w:val="clear" w:color="auto" w:fill="FFFFFF"/>
+            <w:tcBorders>
+              <w:top w:val="single" w:sz="4" w:space="0" w:color="999999"/>
+              <w:left w:val="single" w:sz="4" w:space="0" w:color="999999"/>
+              <w:bottom w:val="single" w:sz="4" w:space="0" w:color="999999"/>
+              <w:right w:val="single" w:sz="4" w:space="0" w:color="999999"/>
+            </w:tcBorders>
+          </w:tcPr>
+          <w:p>
+            <w:r>
+              <w:rPr>
+                <w:b/>
+                <w:i w:val="0"/>
+                <w:sz w:val="18"/>
+              </w:rPr>
+              <w:t>1549</w:t>
+            </w:r>
+          </w:p>
+        </w:tc>
+        <w:tc>
+          <w:tcPr>
+            <w:tcW w:type="dxa" w:w="3120"/>
+            <w:shd w:val="clear" w:color="auto" w:fill="FFFFFF"/>
+            <w:tcBorders>
+              <w:top w:val="single" w:sz="4" w:space="0" w:color="999999"/>
+              <w:left w:val="single" w:sz="4" w:space="0" w:color="999999"/>
+              <w:bottom w:val="single" w:sz="4" w:space="0" w:color="999999"/>
+              <w:right w:val="single" w:sz="4" w:space="0" w:color="999999"/>
+            </w:tcBorders>
+          </w:tcPr>
+          <w:p>
+            <w:r>
+              <w:rPr>
+                <w:b w:val="0"/>
+                <w:i w:val="0"/>
+                <w:sz w:val="18"/>
+              </w:rPr>
+              <w:t>C–N stretching; N–H in-plane bending; naphthalene skeletal vibrations</w:t>
+            </w:r>
+          </w:p>
+        </w:tc>
+        <w:tc>
+          <w:tcPr>
+            <w:tcW w:type="dxa" w:w="3120"/>
+            <w:shd w:val="clear" w:color="auto" w:fill="FFFFFF"/>
+            <w:tcBorders>
+              <w:top w:val="single" w:sz="4" w:space="0" w:color="999999"/>
+              <w:left w:val="single" w:sz="4" w:space="0" w:color="999999"/>
+              <w:bottom w:val="single" w:sz="4" w:space="0" w:color="999999"/>
+              <w:right w:val="single" w:sz="4" w:space="0" w:color="999999"/>
+            </w:tcBorders>
+          </w:tcPr>
+          <w:p>
+            <w:r>
+              <w:rPr>
+                <w:b w:val="0"/>
+                <w:i w:val="0"/>
+                <w:sz w:val="18"/>
+              </w:rPr>
+              <w:t>[18,19]</w:t>
+            </w:r>
+          </w:p>
+        </w:tc>
+      </w:tr>
+      <w:tr>
+        <w:tc>
+          <w:tcPr>
+            <w:tcW w:type="dxa" w:w="3120"/>
+            <w:shd w:val="clear" w:color="auto" w:fill="FFF4E0"/>
+            <w:tcBorders>
+              <w:top w:val="single" w:sz="4" w:space="0" w:color="999999"/>
+              <w:left w:val="single" w:sz="4" w:space="0" w:color="999999"/>
+              <w:bottom w:val="single" w:sz="4" w:space="0" w:color="999999"/>
+              <w:right w:val="single" w:sz="4" w:space="0" w:color="999999"/>
+            </w:tcBorders>
+          </w:tcPr>
+          <w:p>
+            <w:r>
+              <w:rPr>
+                <w:b/>
+                <w:i/>
+                <w:sz w:val="18"/>
+              </w:rPr>
+              <w:t>∼1580 *</w:t>
+            </w:r>
+          </w:p>
+        </w:tc>
+        <w:tc>
+          <w:tcPr>
+            <w:tcW w:type="dxa" w:w="3120"/>
+            <w:shd w:val="clear" w:color="auto" w:fill="FFF4E0"/>
+            <w:tcBorders>
+              <w:top w:val="single" w:sz="4" w:space="0" w:color="999999"/>
+              <w:left w:val="single" w:sz="4" w:space="0" w:color="999999"/>
+              <w:bottom w:val="single" w:sz="4" w:space="0" w:color="999999"/>
+              <w:right w:val="single" w:sz="4" w:space="0" w:color="999999"/>
+            </w:tcBorders>
+          </w:tcPr>
+          <w:p>
+            <w:r>
+              <w:rPr>
+                <w:b w:val="0"/>
+                <w:i/>
+                <w:sz w:val="18"/>
+              </w:rPr>
+              <w:t>Graphene G band (E₂g) — Gr-coated samples only; overlaps 1598 cm⁻¹ SSY band</w:t>
+            </w:r>
+          </w:p>
+        </w:tc>
+        <w:tc>
+          <w:tcPr>
+            <w:tcW w:type="dxa" w:w="3120"/>
+            <w:shd w:val="clear" w:color="auto" w:fill="FFF4E0"/>
+            <w:tcBorders>
+              <w:top w:val="single" w:sz="4" w:space="0" w:color="999999"/>
+              <w:left w:val="single" w:sz="4" w:space="0" w:color="999999"/>
+              <w:bottom w:val="single" w:sz="4" w:space="0" w:color="999999"/>
+              <w:right w:val="single" w:sz="4" w:space="0" w:color="999999"/>
+            </w:tcBorders>
+          </w:tcPr>
+          <w:p>
+            <w:r>
+              <w:rPr>
+                <w:b w:val="0"/>
+                <w:i w:val="0"/>
+                <w:sz w:val="18"/>
+              </w:rPr>
+              <w:t>[30,31]</w:t>
+            </w:r>
+          </w:p>
+        </w:tc>
+      </w:tr>
+      <w:tr>
+        <w:tc>
+          <w:tcPr>
+            <w:tcW w:type="dxa" w:w="3120"/>
+            <w:shd w:val="clear" w:color="auto" w:fill="FFFFFF"/>
+            <w:tcBorders>
+              <w:top w:val="single" w:sz="4" w:space="0" w:color="999999"/>
+              <w:left w:val="single" w:sz="4" w:space="0" w:color="999999"/>
+              <w:bottom w:val="single" w:sz="4" w:space="0" w:color="999999"/>
+              <w:right w:val="single" w:sz="4" w:space="0" w:color="999999"/>
+            </w:tcBorders>
+          </w:tcPr>
+          <w:p>
+            <w:r>
+              <w:rPr>
+                <w:b/>
+                <w:i w:val="0"/>
+                <w:sz w:val="18"/>
+              </w:rPr>
+              <w:t>1598</w:t>
+            </w:r>
+          </w:p>
+        </w:tc>
+        <w:tc>
+          <w:tcPr>
+            <w:tcW w:type="dxa" w:w="3120"/>
+            <w:shd w:val="clear" w:color="auto" w:fill="FFFFFF"/>
+            <w:tcBorders>
+              <w:top w:val="single" w:sz="4" w:space="0" w:color="999999"/>
+              <w:left w:val="single" w:sz="4" w:space="0" w:color="999999"/>
+              <w:bottom w:val="single" w:sz="4" w:space="0" w:color="999999"/>
+              <w:right w:val="single" w:sz="4" w:space="0" w:color="999999"/>
+            </w:tcBorders>
+          </w:tcPr>
+          <w:p>
+            <w:r>
+              <w:rPr>
+                <w:b w:val="0"/>
+                <w:i w:val="0"/>
+                <w:sz w:val="18"/>
+              </w:rPr>
+              <w:t>Symmetric C–C stretching of naphthalene (R1) and phenyl (R2); extended π-conjugation (most intense band)</w:t>
+            </w:r>
+          </w:p>
+        </w:tc>
+        <w:tc>
+          <w:tcPr>
+            <w:tcW w:type="dxa" w:w="3120"/>
+            <w:shd w:val="clear" w:color="auto" w:fill="FFFFFF"/>
+            <w:tcBorders>
+              <w:top w:val="single" w:sz="4" w:space="0" w:color="999999"/>
+              <w:left w:val="single" w:sz="4" w:space="0" w:color="999999"/>
+              <w:bottom w:val="single" w:sz="4" w:space="0" w:color="999999"/>
+              <w:right w:val="single" w:sz="4" w:space="0" w:color="999999"/>
+            </w:tcBorders>
+          </w:tcPr>
+          <w:p>
+            <w:r>
+              <w:rPr>
+                <w:b w:val="0"/>
+                <w:i w:val="0"/>
+                <w:sz w:val="18"/>
+              </w:rPr>
+              <w:t>[18,19]</w:t>
+            </w:r>
+          </w:p>
+        </w:tc>
+      </w:tr>
+    </w:tbl>
+    <w:p>
+      <w:r>
+        <w:rPr>
+          <w:i/>
+          <w:sz w:val="18"/>
+        </w:rPr>
+        <w:t>Table 1. Raman vibrational band assignments for SSY in the keto-hydrazone tautomeric form over the 500–1800 cm⁻¹ spectral window, based on DFT calculations and experimental literature data [18,19,21,29]. Entries marked * are attributed to the graphene interlayer and appear exclusively in Gr-coated sample configurations (highlighted in amber).</w:t>
       </w:r>
     </w:p>
     <w:p>

</xml_diff>

<commit_message>
Restore spectral range to 450–1800 cm⁻¹; re-add 460–490 cm⁻¹ row to Table 1
- Updated all spectral range references from 500→450 cm⁻¹ in Section 3.1,
  Methods 2.2, Figure 1 caption, and Table 1 caption
- Re-added 460–490 cm⁻¹ out-of-plane ring deformation row as first data row
  in Table 1 (band assignment: δ(C–C–C) out-of-plane ring deformation)
- Restored out-of-plane skeletal region label to "450–700 cm⁻¹"
- Table 1 now has 20 data rows covering full 450–1800 cm⁻¹ range

Co-Authored-By: Claude Sonnet 4.6 <noreply@anthropic.com>
Claude-Session: https://claude.ai/code/session_01MNVMUP3XQfcv4xQxHGe3PS
</commit_message>
<xml_diff>
--- a/MANUSCRIPT-SpectroActaPartA-FAGGIO_revised.docx
+++ b/MANUSCRIPT-SpectroActaPartA-FAGGIO_revised.docx
@@ -1769,7 +1769,7 @@
         <w:jc w:val="both"/>
       </w:pPr>
       <w:r>
-        <w:t>All data analysis was performed in Python (v3.x) version. Raw Raman spectra were cropped to the significant spectral region (500–1800 cm⁻¹) and then smoothed by Savitzky–Golay filtering (window = 7 points, polynomial order = 2) implemented in SciPy. Variable importance in projection (VIP) scores were computed from a preliminary 3-component PLS model fitted exclusively on scaled (zero mean, unit variance) training data. We kept the top-N highest-VIP variables for the training of the models, where N ∈ {1000, 1500, 1800, 2200}. All scaling and VIP calculation were performed only on training data to avoid information leakage. The specific thresholds N ∈ {1000, 1500, 1800, 2200} were chosen to systematically probe the sensitivity of model performance to the size of the VIP-selected feature space, ranging from a conservative selection (1000 variables, approximately 44.9% of the 2228-point spectral window, close to the number of variables exceeding VIP &gt; 1 in the preliminary model) to a near-complete retention (2200 variables, 98.7%). This range was designed to bracket the conventional VIP &gt; 1 cutoff and assess whether stricter or more permissive selections systematically alter classification outcomes.</w:t>
+        <w:t>All data analysis was performed in Python (v3.x) version. Raw Raman spectra were cropped to the significant spectral region (450–1800 cm⁻¹) and then smoothed by Savitzky–Golay filtering (window = 7 points, polynomial order = 2) implemented in SciPy. Variable importance in projection (VIP) scores were computed from a preliminary 3-component PLS model fitted exclusively on scaled (zero mean, unit variance) training data. We kept the top-N highest-VIP variables for the training of the models, where N ∈ {1000, 1500, 1800, 2200}. All scaling and VIP calculation were performed only on training data to avoid information leakage. The specific thresholds N ∈ {1000, 1500, 1800, 2200} were chosen to systematically probe the sensitivity of model performance to the size of the VIP-selected feature space, ranging from a conservative selection (1000 variables, approximately 44.9% of the 2228-point spectral window, close to the number of variables exceeding VIP &gt; 1 in the preliminary model) to a near-complete retention (2200 variables, 98.7%). This range was designed to bracket the conventional VIP &gt; 1 cutoff and assess whether stricter or more permissive selections systematically alter classification outcomes.</w:t>
       </w:r>
       <w:r/>
       <w:r/>
@@ -2064,7 +2064,7 @@
           <w:rFonts w:eastAsia="MS Mincho"/>
           <w:lang w:val="en-US" w:eastAsia="en-US"/>
         </w:rPr>
-        <w:t>Figure 1 depicts the mean Raman spectra of four SSY substrate configurations in the range of 500–1800 cm⁻¹ over 80 measurements (±1 standard deviation, grey shading), plotted as a function of Raman shift (cm⁻¹). All dominant Raman bands are consistent with the literature for the keto-hydrazone tautomer of SSY, which dominates in the condensed film state [18,19,29]. The complete vibrational assignment, organised by spectral region, is as follows. In the out-of-plane skeletal region (500–700 cm⁻¹), the weak but reproducible bands arise from low-frequency collective motions of the molecular framework. Bands in the 530–560 cm⁻¹ range are assigned to the symmetric SO₃⁻ deformation (δₛ SO₃⁻) and out-of-plane ring torsion of the naphthalene (R1) system, reflecting the sulfonation pattern characteristic of the keto-hydrazone geometry [18,19]. Bands in the 580–630 cm⁻¹ range are attributed to C–S stretching coupled with ring skeletal bending, while the 640–680 cm⁻¹ region encompasses C–H out-of-plane bending (γ C–H) of both the naphthalene (R1) and phenyl (R2) rings [19,21]. The C–H out-of-plane deformation and ring breathing region (700–1000 cm⁻¹) contains bands most sensitive to the ring substitution pattern and the tautomeric configuration. Bands near 700–730 cm⁻¹ are assigned to C–H out-of-plane wagging of the naphthalene ring coupled with ring skeletal deformation [19,21]. The spectral feature at 770–800 cm⁻¹ corresponds to the naphthalene ring breathing mode, together with C–H out-of-plane bending of the peri-substituted aromatic positions [18,19]. Bands around 830–870 cm⁻¹ arise from ring deformation and C–H out-of-plane bending of the para-substituted phenyl ring (R2) [19,21]. Importantly, the feature at approximately 960–990 cm⁻¹ is assigned to the N–N stretching vibration of the hydrazone linkage (ν N–N, hydrazone form), a band diagnostic of the keto-hydrazone tautomer that would be absent or shifted in the azo form [19]. Its presence confirms the hydrazone character of SSY in the deposited films across all four substrate configurations. In the 1000–1090 cm⁻¹ range, the observed bands are assigned to ring trigonal bending, C–H in-plane bending and skeletal ring vibrations, consistent with the in-plane deformation modes of the conjugated naphthalene–hydrazone–phenyl framework [18,19,29]. The fingerprint region I (1094–1229 cm⁻¹) encompasses bending and deformation vibration modes of the naphthalene (R1) and phenyl (R2) rings at 1094 and 1127 cm⁻¹, respectively, alongside SO₃ group activity and C–N stretching coupled with N–H and naphthalene deformation modes at 1182 and 1229 cm⁻¹, collectively reflecting the stability of the sulfonate substituents on all examined substrates [18,19,29]. In the fingerprint region II (1335–1480 cm⁻¹), vibrational modes of the naphthalene and phenyl rings coexist with C–N, N–H and N–N stretching contributions of the hydrazone tautomer, characteristic of the hydrazone linkage and the extended aromatic core of SSY [18,19]. The D band of graphene (∼1350 cm⁻¹) coincides with this N–N/C–N hydrazone stretching region in the graphene-coated spectra. In the high-frequency region (1501–1598 cm⁻¹), the bands at 1501 and 1549 cm⁻¹ arise from C=O and C–N stretching coupled with N–H in-plane bending and naphthalene skeletal vibrations, respectively, where the C=O stretching is a hallmark of the keto-hydrazone tautomeric form [18,19]. The most intense band at 1598 cm⁻¹ is assigned to symmetric C–C stretching of the naphthalene (R1) and phenyl (R2) rings, reflecting the extended π-conjugation of the SSY chromophore [18,19]. The graphene G band (∼1580 cm⁻¹) is superimposed on this region in the Gr-coated spectra and partially overlaps with the 1598 cm⁻¹ SSY band. By visual inspection, all four SSY spectra are virtually indistinguishable across the entire 500–1800 cm⁻¹ window despite the substrate-dependent interfacial environments. This high spectral similarity constitutes the fundamental analytical challenge and motivates the machine learning approach described in the following sections.</w:t>
+        <w:t>Figure 1 depicts the mean Raman spectra of four SSY substrate configurations in the range of 450–1800 cm⁻¹ over 80 measurements (±1 standard deviation, grey shading), plotted as a function of Raman shift (cm⁻¹). All dominant Raman bands are consistent with the literature for the keto-hydrazone tautomer of SSY, which dominates in the condensed film state [18,19,29]. The complete vibrational assignment, organised by spectral region, is as follows. In the out-of-plane skeletal region (450–700 cm⁻¹), the weak but reproducible bands arise from low-frequency collective motions of the molecular framework. Bands in the 460–490 cm⁻¹ range are attributed to out-of-plane ring deformation modes (γ ring) of the naphthalene (R1) system, corresponding to the wagging and torsion of the aromatic backbone characteristic of the keto-hydrazone geometry [19,21]. Bands in the 530–560 cm⁻¹ range are assigned to the symmetric SO₃⁻ deformation (δₛ SO₃⁻) and out-of-plane ring torsion of the naphthalene (R1) system, reflecting the sulfonation pattern characteristic of the keto-hydrazone geometry [18,19]. Bands in the 580–630 cm⁻¹ range are attributed to C–S stretching coupled with ring skeletal bending, while the 640–680 cm⁻¹ region encompasses C–H out-of-plane bending (γ C–H) of both the naphthalene (R1) and phenyl (R2) rings [19,21]. The C–H out-of-plane deformation and ring breathing region (700–1000 cm⁻¹) contains bands most sensitive to the ring substitution pattern and the tautomeric configuration. Bands near 700–730 cm⁻¹ are assigned to C–H out-of-plane wagging of the naphthalene ring coupled with ring skeletal deformation [19,21]. The spectral feature at 770–800 cm⁻¹ corresponds to the naphthalene ring breathing mode, together with C–H out-of-plane bending of the peri-substituted aromatic positions [18,19]. Bands around 830–870 cm⁻¹ arise from ring deformation and C–H out-of-plane bending of the para-substituted phenyl ring (R2) [19,21]. Importantly, the feature at approximately 960–990 cm⁻¹ is assigned to the N–N stretching vibration of the hydrazone linkage (ν N–N, hydrazone form), a band diagnostic of the keto-hydrazone tautomer that would be absent or shifted in the azo form [19]. Its presence confirms the hydrazone character of SSY in the deposited films across all four substrate configurations. In the 1000–1090 cm⁻¹ range, the observed bands are assigned to ring trigonal bending, C–H in-plane bending and skeletal ring vibrations, consistent with the in-plane deformation modes of the conjugated naphthalene–hydrazone–phenyl framework [18,19,29]. The fingerprint region I (1094–1229 cm⁻¹) encompasses bending and deformation vibration modes of the naphthalene (R1) and phenyl (R2) rings at 1094 and 1127 cm⁻¹, respectively, alongside SO₃ group activity and C–N stretching coupled with N–H and naphthalene deformation modes at 1182 and 1229 cm⁻¹, collectively reflecting the stability of the sulfonate substituents on all examined substrates [18,19,29]. In the fingerprint region II (1335–1480 cm⁻¹), vibrational modes of the naphthalene and phenyl rings coexist with C–N, N–H and N–N stretching contributions of the hydrazone tautomer, characteristic of the hydrazone linkage and the extended aromatic core of SSY [18,19]. The D band of graphene (∼1350 cm⁻¹) coincides with this N–N/C–N hydrazone stretching region in the graphene-coated spectra. In the high-frequency region (1501–1598 cm⁻¹), the bands at 1501 and 1549 cm⁻¹ arise from C=O and C–N stretching coupled with N–H in-plane bending and naphthalene skeletal vibrations, respectively, where the C=O stretching is a hallmark of the keto-hydrazone tautomeric form [18,19]. The most intense band at 1598 cm⁻¹ is assigned to symmetric C–C stretching of the naphthalene (R1) and phenyl (R2) rings, reflecting the extended π-conjugation of the SSY chromophore [18,19]. The graphene G band (∼1580 cm⁻¹) is superimposed on this region in the Gr-coated spectra and partially overlaps with the 1598 cm⁻¹ SSY band. By visual inspection, all four SSY spectra are virtually indistinguishable across the entire 450–1800 cm⁻¹ window despite the substrate-dependent interfacial environments. This high spectral similarity constitutes the fundamental analytical challenge and motivates the machine learning approach described in the following sections.</w:t>
       </w:r>
       <w:r>
         <w:rPr>
@@ -2249,6 +2249,74 @@
                 <w:sz w:val="18"/>
               </w:rPr>
               <w:t>Ref.</w:t>
+            </w:r>
+          </w:p>
+        </w:tc>
+      </w:tr>
+      <w:tr>
+        <w:tc>
+          <w:tcPr>
+            <w:tcW w:type="dxa" w:w="3120"/>
+            <w:shd w:val="clear" w:color="auto" w:fill="F0F4FF"/>
+            <w:tcBorders>
+              <w:top w:val="single" w:sz="4" w:space="0" w:color="999999"/>
+              <w:left w:val="single" w:sz="4" w:space="0" w:color="999999"/>
+              <w:bottom w:val="single" w:sz="4" w:space="0" w:color="999999"/>
+              <w:right w:val="single" w:sz="4" w:space="0" w:color="999999"/>
+            </w:tcBorders>
+          </w:tcPr>
+          <w:p>
+            <w:r>
+              <w:rPr>
+                <w:b/>
+                <w:i w:val="0"/>
+                <w:sz w:val="18"/>
+              </w:rPr>
+              <w:t>460–490</w:t>
+            </w:r>
+          </w:p>
+        </w:tc>
+        <w:tc>
+          <w:tcPr>
+            <w:tcW w:type="dxa" w:w="3120"/>
+            <w:shd w:val="clear" w:color="auto" w:fill="F0F4FF"/>
+            <w:tcBorders>
+              <w:top w:val="single" w:sz="4" w:space="0" w:color="999999"/>
+              <w:left w:val="single" w:sz="4" w:space="0" w:color="999999"/>
+              <w:bottom w:val="single" w:sz="4" w:space="0" w:color="999999"/>
+              <w:right w:val="single" w:sz="4" w:space="0" w:color="999999"/>
+            </w:tcBorders>
+          </w:tcPr>
+          <w:p>
+            <w:r>
+              <w:rPr>
+                <w:b w:val="0"/>
+                <w:i w:val="0"/>
+                <w:sz w:val="18"/>
+              </w:rPr>
+              <w:t>Out-of-plane ring deformation (γ ring) of naphthalene (R1); backbone wagging and torsion characteristic of the keto-hydrazone geometry</w:t>
+            </w:r>
+          </w:p>
+        </w:tc>
+        <w:tc>
+          <w:tcPr>
+            <w:tcW w:type="dxa" w:w="3120"/>
+            <w:shd w:val="clear" w:color="auto" w:fill="F0F4FF"/>
+            <w:tcBorders>
+              <w:top w:val="single" w:sz="4" w:space="0" w:color="999999"/>
+              <w:left w:val="single" w:sz="4" w:space="0" w:color="999999"/>
+              <w:bottom w:val="single" w:sz="4" w:space="0" w:color="999999"/>
+              <w:right w:val="single" w:sz="4" w:space="0" w:color="999999"/>
+            </w:tcBorders>
+          </w:tcPr>
+          <w:p>
+            <w:r>
+              <w:rPr>
+                <w:b w:val="0"/>
+                <w:i w:val="0"/>
+                <w:sz w:val="18"/>
+              </w:rPr>
+              <w:t>[19,21]</w:t>
             </w:r>
           </w:p>
         </w:tc>
@@ -3484,7 +3552,7 @@
           <w:i/>
           <w:sz w:val="18"/>
         </w:rPr>
-        <w:t>Table 1. Raman vibrational band assignments for SSY in the keto-hydrazone tautomeric form over the 500–1800 cm⁻¹ spectral window, based on DFT calculations and experimental literature data [18,19,21,29]. Entries marked * are attributed to the graphene interlayer and appear exclusively in Gr-coated sample configurations (highlighted in amber).</w:t>
+        <w:t>Table 1. Raman vibrational band assignments for SSY in the keto-hydrazone tautomeric form over the 450–1800 cm⁻¹ spectral window, based on DFT calculations and experimental literature data [18,19,21,29]. Entries marked * are attributed to the graphene interlayer and appear exclusively in Gr-coated sample configurations (highlighted in amber).</w:t>
       </w:r>
     </w:p>
     <w:p>
@@ -3568,7 +3636,7 @@
           <w:sz w:val="22"/>
           <w:szCs w:val="22"/>
         </w:rPr>
-        <w:t>Figure 1: Mean Raman spectra (± 1 SD, shaded grey region) of four SSY samples after baseline correction, plotted as a function of Raman shift (cm⁻¹) over the analytical window 500–1800 cm⁻¹. Note: the x-axis in the original figure should be labelled 'Raman shift (cm⁻¹)'.</w:t>
+        <w:t>Figure 1: Mean Raman spectra (± 1 SD, shaded grey region) of four SSY samples after baseline correction, plotted as a function of Raman shift (cm⁻¹) over the analytical window 450–1800 cm⁻¹. Note: the x-axis in the original figure should be labelled 'Raman shift (cm⁻¹)'.</w:t>
       </w:r>
       <w:r>
         <w:rPr>

</xml_diff>

<commit_message>
Update Section 3.3 VIP paragraph and Section 2.2 precision
- Replace duplicate VIP paragraphs [50]/[51] with single revised paragraph
  citing Figure 6, covering all four spectral regions including 450–700 cm⁻¹
  out-of-plane deformations (previously missing), global VIP maximum at
  ~1440–1450 cm⁻¹, and precise 891-band VIP > 1 count
- Section 2.2: add specific count "891 variables (40.0%)" for VIP > 1 to
  match Figure 6 legend and give reviewers a verifiable number

Co-Authored-By: Claude Sonnet 4.6 <noreply@anthropic.com>
Claude-Session: https://claude.ai/code/session_01MNVMUP3XQfcv4xQxHGe3PS
</commit_message>
<xml_diff>
--- a/MANUSCRIPT-SpectroActaPartA-FAGGIO_revised.docx
+++ b/MANUSCRIPT-SpectroActaPartA-FAGGIO_revised.docx
@@ -1769,7 +1769,7 @@
         <w:jc w:val="both"/>
       </w:pPr>
       <w:r>
-        <w:t>All data analysis was performed in Python (v3.x) version. Raw Raman spectra were cropped to the significant spectral region (450–1800 cm⁻¹) and then smoothed by Savitzky–Golay filtering (window = 7 points, polynomial order = 2) implemented in SciPy. Variable importance in projection (VIP) scores were computed from a preliminary 3-component PLS model fitted exclusively on scaled (zero mean, unit variance) training data. We kept the top-N highest-VIP variables for the training of the models, where N ∈ {1000, 1500, 1800, 2200}. All scaling and VIP calculation were performed only on training data to avoid information leakage. The specific thresholds N ∈ {1000, 1500, 1800, 2200} were chosen to systematically probe the sensitivity of model performance to the size of the VIP-selected feature space, ranging from a conservative selection (1000 variables, approximately 44.9% of the 2228-point spectral window, close to the number of variables exceeding VIP &gt; 1 in the preliminary model) to a near-complete retention (2200 variables, 98.7%). This range was designed to bracket the conventional VIP &gt; 1 cutoff and assess whether stricter or more permissive selections systematically alter classification outcomes.</w:t>
+        <w:t>All data analysis was performed in Python (v3.x) version. Raw Raman spectra were cropped to the significant spectral region (450–1800 cm⁻¹) and then smoothed by Savitzky–Golay filtering (window = 7 points, polynomial order = 2) implemented in SciPy. Variable importance in projection (VIP) scores were computed from a preliminary 3-component PLS model fitted exclusively on scaled (zero mean, unit variance) training data. We kept the top-N highest-VIP variables for the training of the models, where N ∈ {1000, 1500, 1800, 2200}. All scaling and VIP calculation were performed only on training data to avoid information leakage. The specific thresholds N ∈ {1000, 1500, 1800, 2200} were chosen to systematically probe the sensitivity of model performance to the size of the VIP-selected feature space, ranging from a conservative selection (1000 variables, approximately 44.9% of the 2228-point spectral window, slightly above the 891 variables (40.0%) exceeding VIP &gt; 1 in the preliminary model) to a near-complete retention (2200 variables, 98.7%). This range was designed to bracket the conventional VIP &gt; 1 cutoff and assess whether stricter or more permissive selections systematically alter classification outcomes.</w:t>
       </w:r>
       <w:r/>
       <w:r/>
@@ -4555,12 +4555,7 @@
     </w:p>
     <w:p>
       <w:r>
-        <w:t>Examination of the VIP score profiles provides molecular-level insight into the spectral basis for substrate discrimination. The variables most consistently assigned high VIP scores are concentrated in three spectral windows: (i) the 1094–1229 cm⁻¹ region encompassing SO₃ and C–N/N–H deformation modes, which are expected to be sensitive to surface-mediated changes in the local electrostatic environment of the sulfonate groups; (ii) the 1335–1480 cm⁻¹ hydrazone/naphthalene stretching region, where differences in inter-chromophore π-stacking induced by substrate polarity may shift vibrational frequencies; and (iii) the 1501–1598 cm⁻¹ region, where C–N/C=O and π-conjugation bands are perturbed by substrate-dependent variations in the orientational order within chromonic aggregates [18,19]. These assignments are consistent with previous polarized Raman and NMR studies showing that the supramolecular organisation of SSY is reflected primarily in its aromatic core and hydrazone linkage vibrational modes [18,19]. The VIP profiles therefore confirm that the classifiers respond to chemically meaningful spectral variation rather than to noise or baseline artefacts.</w:t>
-      </w:r>
-    </w:p>
-    <w:p>
-      <w:r>
-        <w:t>Examination of the VIP score profiles provides molecular-level insight into the spectral basis for substrate discrimination. The variables most consistently assigned high VIP scores across models and VIP thresholds are concentrated in three spectral windows: (i) the 1094–1229 cm⁻¹ region encompassing SO₃ and C–N/N–H deformation modes, which are expected to be sensitive to surface-mediated changes in the local electrostatic environment of the sulfonate groups; (ii) the 1335–1480 cm⁻¹ hydrazone/naphthalene stretching region, where differences in inter-chromophore π-stacking induced by substrate polarity may shift vibrational frequencies; and (iii) the 1501–1598 cm⁻¹ region, where the C–N/C=O/π-conjugation bands are likely perturbed by substrate-dependent variations in the degree of orientational order within the chromonic aggregates. These assignments are consistent with previous polarized Raman and NMR studies showing that the supramolecular organisation of SSY is reflected primarily in its aromatic core and hydrazone linkage vibrational modes [18,19]. The VIP profiles therefore confirm that the classifier is responding to chemically meaningful spectral variation rather than to noise or baseline artefacts.</w:t>
+        <w:t>The VIP score profile obtained from the preliminary 3-LV PLS-DA model, computed exclusively on the training data, is shown in Figure 6. Of the 2228 spectral variables in the 450–1800 cm⁻¹ window, 891 (40.0%) exceed the conventional VIP &gt; 1 threshold; the top-1000 variables used for classification (green rug marks, Figure 6) therefore encompass all of these informative bands plus approximately 109 variables at the VIP ≈ 1 boundary, collectively covering 44.9% of the spectral window. Four spectral regions account for the majority of high-VIP variables. (i) In the 450–700 cm⁻¹ region, multiple peaks exceed the threshold, corresponding to out-of-plane δ(C–C–C) ring deformation and δ(ring) skeletal modes of the naphthalene scaffold; the recurring VIP activity in this region suggests that substrate-induced changes in chromophore packing geometry are reflected in the low-frequency deformation landscape. (ii) The 1094–1229 cm⁻¹ window hosts several of the highest individual VIP values (pronounced maxima near 1127 and 1200 cm⁻¹), encompassing ν(C–N), ν(C–S), and δ(N–H) modes of the sulfonated hydrazone linkage; these modes are particularly sensitive to surface-mediated perturbations of the local electrostatic environment surrounding the sulfonate groups. (iii) The 1335–1480 cm⁻¹ region carries the global VIP maximum (≈ 2.6, near 1440–1450 cm⁻¹), attributed to ν(C=C) and δ(C–H) stretching modes of the naphthalene aromatic core; the pronounced VIP prominence here likely reflects substrate-polarity-driven differences in π–π inter-chromophore stacking distances. (iv) The 1501–1598 cm⁻¹ region, encompassing ν(C=N) and aromatic ν(C=C) modes of the conjugated chromophore system, contributes additional discriminant information consistent with substrate-dependent modulation of orientational order within chromonic aggregates [18,19]. The concentration of high-VIP variables in these chemically interpretable windows confirms that both classifiers exploit genuine molecular-level spectral variation tied to substrate identity, rather than baseline drift or instrumental noise.</w:t>
       </w:r>
     </w:p>
     <w:p>

</xml_diff>